<commit_message>
Stylistic changes for the main.cpp file
</commit_message>
<xml_diff>
--- a/Sprawozdanie.docx
+++ b/Sprawozdanie.docx
@@ -2,6 +2,1582 @@
 <file path=word/document.xml><?xml version="1.0" encoding="utf-8"?>
 <w:document xmlns:wpc="http://schemas.microsoft.com/office/word/2010/wordprocessingCanvas" xmlns:cx="http://schemas.microsoft.com/office/drawing/2014/chartex" xmlns:cx1="http://schemas.microsoft.com/office/drawing/2015/9/8/chartex" xmlns:cx2="http://schemas.microsoft.com/office/drawing/2015/10/21/chartex" xmlns:cx3="http://schemas.microsoft.com/office/drawing/2016/5/9/chartex" xmlns:cx4="http://schemas.microsoft.com/office/drawing/2016/5/10/chartex" xmlns:cx5="http://schemas.microsoft.com/office/drawing/2016/5/11/chartex" xmlns:cx6="http://schemas.microsoft.com/office/drawing/2016/5/12/chartex" xmlns:cx7="http://schemas.microsoft.com/office/drawing/2016/5/13/chartex" xmlns:cx8="http://schemas.microsoft.com/office/drawing/2016/5/14/chartex" xmlns:mc="http://schemas.openxmlformats.org/markup-compatibility/2006" xmlns:aink="http://schemas.microsoft.com/office/drawing/2016/ink" xmlns:am3d="http://schemas.microsoft.com/office/drawing/2017/model3d" xmlns:o="urn:schemas-microsoft-com:office:office" xmlns:oel="http://schemas.microsoft.com/office/2019/extlst" xmlns:r="http://schemas.openxmlformats.org/officeDocument/2006/relationships" xmlns:m="http://schemas.openxmlformats.org/officeDocument/2006/math" xmlns:v="urn:schemas-microsoft-com:vml" xmlns:wp14="http://schemas.microsoft.com/office/word/2010/wordprocessingDrawing" xmlns:wp="http://schemas.openxmlformats.org/drawingml/2006/wordprocessingDrawing" xmlns:w10="urn:schemas-microsoft-com:office:word" xmlns:w="http://schemas.openxmlformats.org/wordprocessingml/2006/main" xmlns:w14="http://schemas.microsoft.com/office/word/2010/wordml" xmlns:w15="http://schemas.microsoft.com/office/word/2012/wordml" xmlns:w16cex="http://schemas.microsoft.com/office/word/2018/wordml/cex" xmlns:w16cid="http://schemas.microsoft.com/office/word/2016/wordml/cid" xmlns:w16="http://schemas.microsoft.com/office/word/2018/wordml" xmlns:w16du="http://schemas.microsoft.com/office/word/2023/wordml/word16du" xmlns:w16sdtdh="http://schemas.microsoft.com/office/word/2020/wordml/sdtdatahash" xmlns:w16sdtfl="http://schemas.microsoft.com/office/word/2024/wordml/sdtformatlock" xmlns:w16se="http://schemas.microsoft.com/office/word/2015/wordml/symex" xmlns:wpg="http://schemas.microsoft.com/office/word/2010/wordprocessingGroup" xmlns:wpi="http://schemas.microsoft.com/office/word/2010/wordprocessingInk" xmlns:wne="http://schemas.microsoft.com/office/word/2006/wordml" xmlns:wps="http://schemas.microsoft.com/office/word/2010/wordprocessingShape" mc:Ignorable="w14 w15 w16se w16cid w16 w16cex w16sdtdh w16sdtfl w16du wp14">
   <w:body>
+    <w:p>
+      <w:pPr>
+        <w:jc w:val="center"/>
+        <w:rPr>
+          <w:rFonts w:eastAsiaTheme="minorEastAsia"/>
+          <w:b/>
+          <w:bCs/>
+          <w:sz w:val="40"/>
+          <w:szCs w:val="40"/>
+        </w:rPr>
+      </w:pPr>
+      <w:r>
+        <w:rPr>
+          <w:rFonts w:eastAsiaTheme="minorEastAsia"/>
+          <w:b/>
+          <w:bCs/>
+          <w:sz w:val="40"/>
+          <w:szCs w:val="40"/>
+        </w:rPr>
+        <w:t>Sortowanie polifazowe</w:t>
+      </w:r>
+    </w:p>
+    <w:p>
+      <w:pPr>
+        <w:rPr>
+          <w:rFonts w:eastAsiaTheme="minorEastAsia"/>
+          <w:b/>
+          <w:bCs/>
+          <w:sz w:val="32"/>
+          <w:szCs w:val="32"/>
+        </w:rPr>
+      </w:pPr>
+      <w:r>
+        <w:rPr>
+          <w:rFonts w:eastAsiaTheme="minorEastAsia"/>
+          <w:b/>
+          <w:bCs/>
+          <w:sz w:val="32"/>
+          <w:szCs w:val="32"/>
+        </w:rPr>
+        <w:t>1.</w:t>
+      </w:r>
+      <w:r>
+        <w:rPr>
+          <w:rFonts w:eastAsiaTheme="minorEastAsia"/>
+          <w:b/>
+          <w:bCs/>
+          <w:sz w:val="32"/>
+          <w:szCs w:val="32"/>
+        </w:rPr>
+        <w:t xml:space="preserve"> </w:t>
+      </w:r>
+      <w:r>
+        <w:rPr>
+          <w:rFonts w:eastAsiaTheme="minorEastAsia"/>
+          <w:b/>
+          <w:bCs/>
+          <w:sz w:val="32"/>
+          <w:szCs w:val="32"/>
+        </w:rPr>
+        <w:t>Wprowadzenie</w:t>
+      </w:r>
+    </w:p>
+    <w:p>
+      <w:pPr>
+        <w:rPr>
+          <w:rFonts w:eastAsiaTheme="minorEastAsia"/>
+        </w:rPr>
+      </w:pPr>
+      <w:r>
+        <w:rPr>
+          <w:rFonts w:eastAsiaTheme="minorEastAsia"/>
+        </w:rPr>
+        <w:t xml:space="preserve">Sortowanie polifazowe jest metodą </w:t>
+      </w:r>
+      <w:r>
+        <w:rPr>
+          <w:rFonts w:eastAsiaTheme="minorEastAsia"/>
+        </w:rPr>
+        <w:t>sortowania</w:t>
+      </w:r>
+      <w:r>
+        <w:rPr>
+          <w:rFonts w:eastAsiaTheme="minorEastAsia"/>
+        </w:rPr>
+        <w:t xml:space="preserve"> zewnętrznego</w:t>
+      </w:r>
+      <w:r>
+        <w:rPr>
+          <w:rFonts w:eastAsiaTheme="minorEastAsia"/>
+        </w:rPr>
+        <w:t xml:space="preserve"> opartą na wielofazowym scalaniu serii</w:t>
+      </w:r>
+      <w:r>
+        <w:rPr>
+          <w:rFonts w:eastAsiaTheme="minorEastAsia"/>
+        </w:rPr>
+        <w:t xml:space="preserve">, która minimalizuje liczbę operacji dyskowych poprzez optymalny rozkład początkowych </w:t>
+      </w:r>
+      <w:r>
+        <w:rPr>
+          <w:rFonts w:eastAsiaTheme="minorEastAsia"/>
+        </w:rPr>
+        <w:t>serii. W przeciwieństwie do klasycznego sortowania naturalnego, sortowanie polifazowe wykorzystuje rozkład serii zgodny z ciągiem Fibonacciego, co po</w:t>
+      </w:r>
+      <w:r>
+        <w:rPr>
+          <w:rFonts w:eastAsiaTheme="minorEastAsia"/>
+        </w:rPr>
+        <w:t>zwala znacznie przyspieszyć proces sortowania.</w:t>
+      </w:r>
+      <w:r>
+        <w:rPr>
+          <w:rFonts w:eastAsiaTheme="minorEastAsia"/>
+        </w:rPr>
+        <w:t xml:space="preserve"> Dokonałem implementacji tego algorytmu i przetestowałem </w:t>
+      </w:r>
+      <w:r>
+        <w:rPr>
+          <w:rFonts w:eastAsiaTheme="minorEastAsia"/>
+        </w:rPr>
+        <w:t>jego skuteczność dla różnych wielkości danych oraz jego zgodność z teoretycznymi założeniami.</w:t>
+      </w:r>
+    </w:p>
+    <w:p>
+      <w:pPr>
+        <w:rPr>
+          <w:rFonts w:eastAsiaTheme="minorEastAsia"/>
+        </w:rPr>
+      </w:pPr>
+    </w:p>
+    <w:p>
+      <w:pPr>
+        <w:rPr>
+          <w:rFonts w:eastAsiaTheme="minorEastAsia"/>
+          <w:b/>
+          <w:bCs/>
+          <w:sz w:val="32"/>
+          <w:szCs w:val="32"/>
+        </w:rPr>
+      </w:pPr>
+      <w:r>
+        <w:rPr>
+          <w:rFonts w:eastAsiaTheme="minorEastAsia"/>
+          <w:b/>
+          <w:bCs/>
+          <w:sz w:val="32"/>
+          <w:szCs w:val="32"/>
+        </w:rPr>
+        <w:t xml:space="preserve">2. </w:t>
+      </w:r>
+      <w:r>
+        <w:rPr>
+          <w:rFonts w:eastAsiaTheme="minorEastAsia"/>
+          <w:b/>
+          <w:bCs/>
+          <w:sz w:val="32"/>
+          <w:szCs w:val="32"/>
+        </w:rPr>
+        <w:t>Opis algorytmu</w:t>
+      </w:r>
+    </w:p>
+    <w:p>
+      <w:pPr>
+        <w:rPr>
+          <w:rFonts w:eastAsiaTheme="minorEastAsia"/>
+          <w:b/>
+          <w:bCs/>
+          <w:sz w:val="28"/>
+          <w:szCs w:val="28"/>
+        </w:rPr>
+      </w:pPr>
+      <w:r>
+        <w:rPr>
+          <w:rFonts w:eastAsiaTheme="minorEastAsia"/>
+          <w:b/>
+          <w:bCs/>
+          <w:sz w:val="28"/>
+          <w:szCs w:val="28"/>
+        </w:rPr>
+        <w:t>2.1. Dystrybucja początkowa</w:t>
+      </w:r>
+    </w:p>
+    <w:p>
+      <w:pPr>
+        <w:rPr>
+          <w:rFonts w:eastAsiaTheme="minorEastAsia"/>
+        </w:rPr>
+      </w:pPr>
+      <w:r>
+        <w:rPr>
+          <w:rFonts w:eastAsiaTheme="minorEastAsia"/>
+        </w:rPr>
+        <w:t>W sortowaniu naturalnym podczas pierwszej dystr</w:t>
+      </w:r>
+      <w:r>
+        <w:rPr>
+          <w:rFonts w:eastAsiaTheme="minorEastAsia"/>
+        </w:rPr>
+        <w:t xml:space="preserve">ybucji serii na dwie taśmy na zmianę wsadzamy napotkane serie do jednej lub do drugiej taśmy, co sprawia, że </w:t>
+      </w:r>
+      <w:r>
+        <w:rPr>
+          <w:rFonts w:eastAsiaTheme="minorEastAsia"/>
+        </w:rPr>
+        <w:t xml:space="preserve">no obu taśmach będzie w przybliżeniu taka sama liczba serii. W sortowaniu polifazowym etap ten wygląda zupełnie inaczej, tutaj również </w:t>
+      </w:r>
+      <w:r>
+        <w:rPr>
+          <w:rFonts w:eastAsiaTheme="minorEastAsia"/>
+        </w:rPr>
+        <w:t xml:space="preserve">przenosimy serie na pierwszą i drugą taśmę jednak w taki sposób, żeby </w:t>
+      </w:r>
+      <w:r>
+        <w:rPr>
+          <w:rFonts w:eastAsiaTheme="minorEastAsia"/>
+        </w:rPr>
+        <w:t xml:space="preserve">ilości taśm na pierwszej i drugiej taśmie były zbliżone do sąsiednich </w:t>
+      </w:r>
+      <w:r>
+        <w:rPr>
+          <w:rFonts w:eastAsiaTheme="minorEastAsia"/>
+        </w:rPr>
+        <w:t>liczb w ciągu Fibonacciego.</w:t>
+      </w:r>
+      <w:r>
+        <w:rPr>
+          <w:rFonts w:eastAsiaTheme="minorEastAsia"/>
+        </w:rPr>
+        <w:t xml:space="preserve"> </w:t>
+      </w:r>
+      <w:proofErr w:type="gramStart"/>
+      <w:r>
+        <w:rPr>
+          <w:rFonts w:eastAsiaTheme="minorEastAsia"/>
+        </w:rPr>
+        <w:t>Przykładowo</w:t>
+      </w:r>
+      <w:proofErr w:type="gramEnd"/>
+      <w:r>
+        <w:rPr>
+          <w:rFonts w:eastAsiaTheme="minorEastAsia"/>
+        </w:rPr>
+        <w:t xml:space="preserve"> kiedy mamy początkowo 8 serii to dzielimy je na 5 i 3, a gdy 13 na 8 i 5 itd. </w:t>
+      </w:r>
+    </w:p>
+    <w:p>
+      <w:pPr>
+        <w:rPr>
+          <w:rFonts w:eastAsiaTheme="minorEastAsia"/>
+          <w:b/>
+          <w:bCs/>
+          <w:sz w:val="28"/>
+          <w:szCs w:val="28"/>
+        </w:rPr>
+      </w:pPr>
+      <w:r>
+        <w:rPr>
+          <w:rFonts w:eastAsiaTheme="minorEastAsia"/>
+          <w:b/>
+          <w:bCs/>
+          <w:sz w:val="28"/>
+          <w:szCs w:val="28"/>
+        </w:rPr>
+        <w:t>2.2. Fazy scalania</w:t>
+      </w:r>
+    </w:p>
+    <w:p>
+      <w:pPr>
+        <w:rPr>
+          <w:rFonts w:eastAsiaTheme="minorEastAsia"/>
+        </w:rPr>
+      </w:pPr>
+      <w:r>
+        <w:rPr>
+          <w:rFonts w:eastAsiaTheme="minorEastAsia"/>
+        </w:rPr>
+        <w:t xml:space="preserve">Kolejne fazy tego algorytmu również różnią się względem </w:t>
+      </w:r>
+      <w:r>
+        <w:rPr>
+          <w:rFonts w:eastAsiaTheme="minorEastAsia"/>
+        </w:rPr>
+        <w:t>sortowania natu</w:t>
+      </w:r>
+      <w:r>
+        <w:rPr>
+          <w:rFonts w:eastAsiaTheme="minorEastAsia"/>
+        </w:rPr>
+        <w:t xml:space="preserve">ralnego. W tym drugim w każdej fazie scalamy wszystkie runy z taśmy 1 z taśmą 2 do taśmy 3 i potem ponownie </w:t>
+      </w:r>
+      <w:r>
+        <w:rPr>
+          <w:rFonts w:eastAsiaTheme="minorEastAsia"/>
+        </w:rPr>
+        <w:t xml:space="preserve">rozkładamy serie na taśmy aż zostanie tylko jedna. Dużą różnicą w przypadku sortowania polifazowego jest fakt, że w każdej fazie nie uczestniczą wszystkie </w:t>
+      </w:r>
+      <w:r>
+        <w:rPr>
+          <w:rFonts w:eastAsiaTheme="minorEastAsia"/>
+        </w:rPr>
+        <w:t xml:space="preserve">serie. W każdej fazie scalamy </w:t>
+      </w:r>
+      <w:r>
+        <w:rPr>
+          <w:rFonts w:eastAsiaTheme="minorEastAsia"/>
+        </w:rPr>
+        <w:t xml:space="preserve">tyle </w:t>
+      </w:r>
+      <w:proofErr w:type="gramStart"/>
+      <w:r>
+        <w:rPr>
+          <w:rFonts w:eastAsiaTheme="minorEastAsia"/>
+        </w:rPr>
+        <w:t>runów</w:t>
+      </w:r>
+      <w:proofErr w:type="gramEnd"/>
+      <w:r>
+        <w:rPr>
+          <w:rFonts w:eastAsiaTheme="minorEastAsia"/>
+        </w:rPr>
+        <w:t xml:space="preserve"> ile jest na mniejszej taśmie (z dwóch na których w ogóle są serie). </w:t>
+      </w:r>
+      <w:r>
+        <w:rPr>
+          <w:rFonts w:eastAsiaTheme="minorEastAsia"/>
+        </w:rPr>
+        <w:t xml:space="preserve">W wyniku </w:t>
+      </w:r>
+      <w:proofErr w:type="gramStart"/>
+      <w:r>
+        <w:rPr>
+          <w:rFonts w:eastAsiaTheme="minorEastAsia"/>
+        </w:rPr>
+        <w:t>tego</w:t>
+      </w:r>
+      <w:proofErr w:type="gramEnd"/>
+      <w:r>
+        <w:rPr>
+          <w:rFonts w:eastAsiaTheme="minorEastAsia"/>
+        </w:rPr>
+        <w:t xml:space="preserve"> jeżeli na pierwszej taśm</w:t>
+      </w:r>
+      <w:r>
+        <w:rPr>
+          <w:rFonts w:eastAsiaTheme="minorEastAsia"/>
+        </w:rPr>
+        <w:t>ach było</w:t>
+      </w:r>
+      <w:r>
+        <w:rPr>
+          <w:rFonts w:eastAsiaTheme="minorEastAsia"/>
+        </w:rPr>
+        <w:t xml:space="preserve"> </w:t>
+      </w:r>
+      <m:oMath>
+        <m:r>
+          <w:rPr>
+            <w:rFonts w:ascii="Cambria Math" w:eastAsiaTheme="minorEastAsia" w:hAnsi="Cambria Math"/>
+          </w:rPr>
+          <m:t>x</m:t>
+        </m:r>
+      </m:oMath>
+      <w:r>
+        <w:rPr>
+          <w:rFonts w:eastAsiaTheme="minorEastAsia"/>
+        </w:rPr>
+        <w:t xml:space="preserve"> i </w:t>
+      </w:r>
+      <m:oMath>
+        <m:r>
+          <w:rPr>
+            <w:rFonts w:ascii="Cambria Math" w:eastAsiaTheme="minorEastAsia" w:hAnsi="Cambria Math"/>
+          </w:rPr>
+          <m:t>ϕx</m:t>
+        </m:r>
+      </m:oMath>
+      <w:r>
+        <w:rPr>
+          <w:rFonts w:eastAsiaTheme="minorEastAsia"/>
+        </w:rPr>
+        <w:t xml:space="preserve"> serii to po scaleniu </w:t>
+      </w:r>
+      <m:oMath>
+        <m:r>
+          <w:rPr>
+            <w:rFonts w:ascii="Cambria Math" w:eastAsiaTheme="minorEastAsia" w:hAnsi="Cambria Math"/>
+          </w:rPr>
+          <m:t>x</m:t>
+        </m:r>
+      </m:oMath>
+      <w:r>
+        <w:rPr>
+          <w:rFonts w:eastAsiaTheme="minorEastAsia"/>
+        </w:rPr>
+        <w:t xml:space="preserve"> serii z obu taśm otrzymamy taśmę o </w:t>
+      </w:r>
+      <m:oMath>
+        <m:r>
+          <w:rPr>
+            <w:rFonts w:ascii="Cambria Math" w:eastAsiaTheme="minorEastAsia" w:hAnsi="Cambria Math"/>
+          </w:rPr>
+          <m:t>x</m:t>
+        </m:r>
+      </m:oMath>
+      <w:r>
+        <w:rPr>
+          <w:rFonts w:eastAsiaTheme="minorEastAsia"/>
+        </w:rPr>
+        <w:t xml:space="preserve"> seriach, a taśmy z których scalaliśmy będą miały ich po </w:t>
+      </w:r>
+      <m:oMath>
+        <m:r>
+          <w:rPr>
+            <w:rFonts w:ascii="Cambria Math" w:eastAsiaTheme="minorEastAsia" w:hAnsi="Cambria Math"/>
+          </w:rPr>
+          <m:t>0</m:t>
+        </m:r>
+      </m:oMath>
+      <w:r>
+        <w:rPr>
+          <w:rFonts w:eastAsiaTheme="minorEastAsia"/>
+        </w:rPr>
+        <w:t xml:space="preserve"> i </w:t>
+      </w:r>
+      <m:oMath>
+        <m:d>
+          <m:dPr>
+            <m:ctrlPr>
+              <w:rPr>
+                <w:rFonts w:ascii="Cambria Math" w:eastAsiaTheme="minorEastAsia" w:hAnsi="Cambria Math"/>
+                <w:i/>
+              </w:rPr>
+            </m:ctrlPr>
+          </m:dPr>
+          <m:e>
+            <m:r>
+              <w:rPr>
+                <w:rFonts w:ascii="Cambria Math" w:eastAsiaTheme="minorEastAsia" w:hAnsi="Cambria Math"/>
+              </w:rPr>
+              <m:t>ϕ-1</m:t>
+            </m:r>
+          </m:e>
+        </m:d>
+        <m:r>
+          <w:rPr>
+            <w:rFonts w:ascii="Cambria Math" w:eastAsiaTheme="minorEastAsia" w:hAnsi="Cambria Math"/>
+          </w:rPr>
+          <m:t>x</m:t>
+        </m:r>
+      </m:oMath>
+      <w:r>
+        <w:rPr>
+          <w:rFonts w:eastAsiaTheme="minorEastAsia"/>
+        </w:rPr>
+        <w:t xml:space="preserve">. </w:t>
+      </w:r>
+      <w:r>
+        <w:rPr>
+          <w:rFonts w:eastAsiaTheme="minorEastAsia"/>
+        </w:rPr>
+        <w:t xml:space="preserve">Na pierwszy rzut oka </w:t>
+      </w:r>
+      <w:r>
+        <w:rPr>
+          <w:rFonts w:eastAsiaTheme="minorEastAsia"/>
+        </w:rPr>
+        <w:t>nie wydaje się to być niczym specjalnym jednak warto zauważyć jaki stosunek ilości runów na naszych taśmach:</w:t>
+      </w:r>
+    </w:p>
+    <w:p>
+      <w:pPr>
+        <w:rPr>
+          <w:rFonts w:eastAsiaTheme="minorEastAsia"/>
+        </w:rPr>
+      </w:pPr>
+      <m:oMathPara>
+        <m:oMath>
+          <m:f>
+            <m:fPr>
+              <m:ctrlPr>
+                <w:rPr>
+                  <w:rFonts w:ascii="Cambria Math" w:eastAsiaTheme="minorEastAsia" w:hAnsi="Cambria Math"/>
+                  <w:i/>
+                </w:rPr>
+              </m:ctrlPr>
+            </m:fPr>
+            <m:num>
+              <m:r>
+                <w:rPr>
+                  <w:rFonts w:ascii="Cambria Math" w:eastAsiaTheme="minorEastAsia" w:hAnsi="Cambria Math"/>
+                </w:rPr>
+                <m:t>x</m:t>
+              </m:r>
+            </m:num>
+            <m:den>
+              <m:d>
+                <m:dPr>
+                  <m:ctrlPr>
+                    <w:rPr>
+                      <w:rFonts w:ascii="Cambria Math" w:eastAsiaTheme="minorEastAsia" w:hAnsi="Cambria Math"/>
+                      <w:i/>
+                    </w:rPr>
+                  </m:ctrlPr>
+                </m:dPr>
+                <m:e>
+                  <m:r>
+                    <w:rPr>
+                      <w:rFonts w:ascii="Cambria Math" w:eastAsiaTheme="minorEastAsia" w:hAnsi="Cambria Math"/>
+                    </w:rPr>
+                    <m:t>ϕ-1</m:t>
+                  </m:r>
+                </m:e>
+              </m:d>
+              <m:r>
+                <w:rPr>
+                  <w:rFonts w:ascii="Cambria Math" w:eastAsiaTheme="minorEastAsia" w:hAnsi="Cambria Math"/>
+                </w:rPr>
+                <m:t>x</m:t>
+              </m:r>
+            </m:den>
+          </m:f>
+          <m:r>
+            <w:rPr>
+              <w:rFonts w:ascii="Cambria Math" w:eastAsiaTheme="minorEastAsia" w:hAnsi="Cambria Math"/>
+            </w:rPr>
+            <m:t>=</m:t>
+          </m:r>
+          <m:f>
+            <m:fPr>
+              <m:ctrlPr>
+                <w:rPr>
+                  <w:rFonts w:ascii="Cambria Math" w:eastAsiaTheme="minorEastAsia" w:hAnsi="Cambria Math"/>
+                  <w:i/>
+                </w:rPr>
+              </m:ctrlPr>
+            </m:fPr>
+            <m:num>
+              <m:r>
+                <w:rPr>
+                  <w:rFonts w:ascii="Cambria Math" w:eastAsiaTheme="minorEastAsia" w:hAnsi="Cambria Math"/>
+                </w:rPr>
+                <m:t>1</m:t>
+              </m:r>
+            </m:num>
+            <m:den>
+              <m:r>
+                <w:rPr>
+                  <w:rFonts w:ascii="Cambria Math" w:eastAsiaTheme="minorEastAsia" w:hAnsi="Cambria Math"/>
+                </w:rPr>
+                <m:t>ϕ-1</m:t>
+              </m:r>
+            </m:den>
+          </m:f>
+          <m:r>
+            <w:rPr>
+              <w:rFonts w:ascii="Cambria Math" w:eastAsiaTheme="minorEastAsia" w:hAnsi="Cambria Math"/>
+            </w:rPr>
+            <m:t>=</m:t>
+          </m:r>
+          <m:r>
+            <w:rPr>
+              <w:rFonts w:ascii="Cambria Math" w:eastAsiaTheme="minorEastAsia" w:hAnsi="Cambria Math"/>
+            </w:rPr>
+            <m:t>ϕ</m:t>
+          </m:r>
+        </m:oMath>
+      </m:oMathPara>
+    </w:p>
+    <w:p>
+      <w:pPr>
+        <w:rPr>
+          <w:rFonts w:eastAsiaTheme="minorEastAsia"/>
+        </w:rPr>
+      </w:pPr>
+      <w:r>
+        <w:rPr>
+          <w:rFonts w:eastAsiaTheme="minorEastAsia"/>
+        </w:rPr>
+        <w:t>Okazuje się, że po tym scalaniu ponownie otrzymaliśmy taśmy o ilości serii, które są sąsiednimi liczbami Fibonacciego</w:t>
+      </w:r>
+      <w:r>
+        <w:rPr>
+          <w:rFonts w:eastAsiaTheme="minorEastAsia"/>
+        </w:rPr>
+        <w:t xml:space="preserve">, a </w:t>
+      </w:r>
+      <w:proofErr w:type="gramStart"/>
+      <w:r>
+        <w:rPr>
+          <w:rFonts w:eastAsiaTheme="minorEastAsia"/>
+        </w:rPr>
+        <w:t>dokładniej</w:t>
+      </w:r>
+      <w:proofErr w:type="gramEnd"/>
+      <w:r>
+        <w:rPr>
+          <w:rFonts w:eastAsiaTheme="minorEastAsia"/>
+        </w:rPr>
+        <w:t xml:space="preserve"> jeżeli początkowo mieliśmy </w:t>
+      </w:r>
+      <m:oMath>
+        <m:sSub>
+          <m:sSubPr>
+            <m:ctrlPr>
+              <w:rPr>
+                <w:rFonts w:ascii="Cambria Math" w:eastAsiaTheme="minorEastAsia" w:hAnsi="Cambria Math"/>
+                <w:i/>
+              </w:rPr>
+            </m:ctrlPr>
+          </m:sSubPr>
+          <m:e>
+            <m:r>
+              <w:rPr>
+                <w:rFonts w:ascii="Cambria Math" w:eastAsiaTheme="minorEastAsia" w:hAnsi="Cambria Math"/>
+              </w:rPr>
+              <m:t>F</m:t>
+            </m:r>
+          </m:e>
+          <m:sub>
+            <m:r>
+              <w:rPr>
+                <w:rFonts w:ascii="Cambria Math" w:eastAsiaTheme="minorEastAsia" w:hAnsi="Cambria Math"/>
+              </w:rPr>
+              <m:t>n</m:t>
+            </m:r>
+          </m:sub>
+        </m:sSub>
+      </m:oMath>
+      <w:r>
+        <w:rPr>
+          <w:rFonts w:eastAsiaTheme="minorEastAsia"/>
+        </w:rPr>
+        <w:t xml:space="preserve"> i </w:t>
+      </w:r>
+      <m:oMath>
+        <m:sSub>
+          <m:sSubPr>
+            <m:ctrlPr>
+              <w:rPr>
+                <w:rFonts w:ascii="Cambria Math" w:eastAsiaTheme="minorEastAsia" w:hAnsi="Cambria Math"/>
+                <w:i/>
+              </w:rPr>
+            </m:ctrlPr>
+          </m:sSubPr>
+          <m:e>
+            <m:r>
+              <w:rPr>
+                <w:rFonts w:ascii="Cambria Math" w:eastAsiaTheme="minorEastAsia" w:hAnsi="Cambria Math"/>
+              </w:rPr>
+              <m:t>F</m:t>
+            </m:r>
+          </m:e>
+          <m:sub>
+            <m:r>
+              <w:rPr>
+                <w:rFonts w:ascii="Cambria Math" w:eastAsiaTheme="minorEastAsia" w:hAnsi="Cambria Math"/>
+              </w:rPr>
+              <m:t>n-1</m:t>
+            </m:r>
+          </m:sub>
+        </m:sSub>
+      </m:oMath>
+      <w:r>
+        <w:rPr>
+          <w:rFonts w:eastAsiaTheme="minorEastAsia"/>
+        </w:rPr>
+        <w:t xml:space="preserve"> serii na taśmach to teraz mamy </w:t>
+      </w:r>
+      <m:oMath>
+        <m:sSub>
+          <m:sSubPr>
+            <m:ctrlPr>
+              <w:rPr>
+                <w:rFonts w:ascii="Cambria Math" w:eastAsiaTheme="minorEastAsia" w:hAnsi="Cambria Math"/>
+                <w:i/>
+              </w:rPr>
+            </m:ctrlPr>
+          </m:sSubPr>
+          <m:e>
+            <m:r>
+              <w:rPr>
+                <w:rFonts w:ascii="Cambria Math" w:eastAsiaTheme="minorEastAsia" w:hAnsi="Cambria Math"/>
+              </w:rPr>
+              <m:t>F</m:t>
+            </m:r>
+          </m:e>
+          <m:sub>
+            <m:r>
+              <w:rPr>
+                <w:rFonts w:ascii="Cambria Math" w:eastAsiaTheme="minorEastAsia" w:hAnsi="Cambria Math"/>
+              </w:rPr>
+              <m:t>n</m:t>
+            </m:r>
+            <m:r>
+              <w:rPr>
+                <w:rFonts w:ascii="Cambria Math" w:eastAsiaTheme="minorEastAsia" w:hAnsi="Cambria Math"/>
+              </w:rPr>
+              <m:t>-1</m:t>
+            </m:r>
+          </m:sub>
+        </m:sSub>
+      </m:oMath>
+      <w:r>
+        <w:rPr>
+          <w:rFonts w:eastAsiaTheme="minorEastAsia"/>
+        </w:rPr>
+        <w:t xml:space="preserve"> i </w:t>
+      </w:r>
+      <m:oMath>
+        <m:sSub>
+          <m:sSubPr>
+            <m:ctrlPr>
+              <w:rPr>
+                <w:rFonts w:ascii="Cambria Math" w:eastAsiaTheme="minorEastAsia" w:hAnsi="Cambria Math"/>
+                <w:i/>
+              </w:rPr>
+            </m:ctrlPr>
+          </m:sSubPr>
+          <m:e>
+            <m:r>
+              <w:rPr>
+                <w:rFonts w:ascii="Cambria Math" w:eastAsiaTheme="minorEastAsia" w:hAnsi="Cambria Math"/>
+              </w:rPr>
+              <m:t>F</m:t>
+            </m:r>
+          </m:e>
+          <m:sub>
+            <m:r>
+              <w:rPr>
+                <w:rFonts w:ascii="Cambria Math" w:eastAsiaTheme="minorEastAsia" w:hAnsi="Cambria Math"/>
+              </w:rPr>
+              <m:t>n-</m:t>
+            </m:r>
+            <m:r>
+              <w:rPr>
+                <w:rFonts w:ascii="Cambria Math" w:eastAsiaTheme="minorEastAsia" w:hAnsi="Cambria Math"/>
+              </w:rPr>
+              <m:t>2</m:t>
+            </m:r>
+          </m:sub>
+        </m:sSub>
+      </m:oMath>
+      <w:r>
+        <w:rPr>
+          <w:rFonts w:eastAsiaTheme="minorEastAsia"/>
+        </w:rPr>
+        <w:t xml:space="preserve">. Łatwo można zauważyć, że to oznacza, że jak odpowiednio długo będzie się wykonywało takie scalanie to w końcu dojdziemy do liczb {1, 0} i zostanie nam tylko jedna seria, czyli plik będzie posortowany. Aby </w:t>
+      </w:r>
+      <w:r>
+        <w:rPr>
+          <w:rFonts w:eastAsiaTheme="minorEastAsia"/>
+        </w:rPr>
+        <w:t>to dokonać w trakcie algorytmu taśmy będą musiały zmieniać swoje role, każda co 3 fazy będzie taśmą, do której scalamy</w:t>
+      </w:r>
+      <w:r>
+        <w:rPr>
+          <w:rFonts w:eastAsiaTheme="minorEastAsia"/>
+        </w:rPr>
+        <w:t xml:space="preserve">, w przeciwieństwie do scalania </w:t>
+      </w:r>
+      <w:proofErr w:type="gramStart"/>
+      <w:r>
+        <w:rPr>
+          <w:rFonts w:eastAsiaTheme="minorEastAsia"/>
+        </w:rPr>
+        <w:t>naturalnego</w:t>
+      </w:r>
+      <w:proofErr w:type="gramEnd"/>
+      <w:r>
+        <w:rPr>
+          <w:rFonts w:eastAsiaTheme="minorEastAsia"/>
+        </w:rPr>
+        <w:t xml:space="preserve"> gdzie role taśm się nie zmieniają w trakcie działania algorytmu.</w:t>
+      </w:r>
+    </w:p>
+    <w:p>
+      <w:pPr>
+        <w:rPr>
+          <w:rFonts w:eastAsiaTheme="minorEastAsia"/>
+          <w:b/>
+          <w:bCs/>
+          <w:sz w:val="28"/>
+          <w:szCs w:val="28"/>
+        </w:rPr>
+      </w:pPr>
+      <w:r>
+        <w:rPr>
+          <w:rFonts w:eastAsiaTheme="minorEastAsia"/>
+          <w:b/>
+          <w:bCs/>
+          <w:sz w:val="28"/>
+          <w:szCs w:val="28"/>
+        </w:rPr>
+        <w:t>2.3. Problemy z początkową dystrybucją serii</w:t>
+      </w:r>
+    </w:p>
+    <w:p>
+      <w:pPr>
+        <w:rPr>
+          <w:rFonts w:eastAsiaTheme="minorEastAsia"/>
+        </w:rPr>
+      </w:pPr>
+      <w:r>
+        <w:rPr>
+          <w:rFonts w:eastAsiaTheme="minorEastAsia"/>
+        </w:rPr>
+        <w:lastRenderedPageBreak/>
+        <w:t xml:space="preserve">Można zadać jednak pytanie, </w:t>
+      </w:r>
+      <w:proofErr w:type="gramStart"/>
+      <w:r>
+        <w:rPr>
+          <w:rFonts w:eastAsiaTheme="minorEastAsia"/>
+        </w:rPr>
+        <w:t>co</w:t>
+      </w:r>
+      <w:proofErr w:type="gramEnd"/>
+      <w:r>
+        <w:rPr>
+          <w:rFonts w:eastAsiaTheme="minorEastAsia"/>
+        </w:rPr>
+        <w:t xml:space="preserve"> jeżeli nie da się przedstawić początkowej liczby serii jako sumę dwóch sąsiednich liczb w ciągu Fibonacciego. Na szczęście jest na to </w:t>
+      </w:r>
+      <w:r>
+        <w:rPr>
+          <w:rFonts w:eastAsiaTheme="minorEastAsia"/>
+        </w:rPr>
+        <w:t xml:space="preserve">bardzo proste rozwiązanie, które rozwiązuje problem </w:t>
+      </w:r>
+      <w:r>
+        <w:rPr>
+          <w:rFonts w:eastAsiaTheme="minorEastAsia"/>
+        </w:rPr>
+        <w:t xml:space="preserve">od razu w pierwszej fazie algorytmu. W </w:t>
+      </w:r>
+      <w:proofErr w:type="gramStart"/>
+      <w:r>
+        <w:rPr>
+          <w:rFonts w:eastAsiaTheme="minorEastAsia"/>
+        </w:rPr>
+        <w:t>przypadku</w:t>
+      </w:r>
+      <w:proofErr w:type="gramEnd"/>
+      <w:r>
+        <w:rPr>
+          <w:rFonts w:eastAsiaTheme="minorEastAsia"/>
+        </w:rPr>
+        <w:t xml:space="preserve"> kiedy mamy liczbę np. 12,</w:t>
+      </w:r>
+      <w:r>
+        <w:rPr>
+          <w:rFonts w:eastAsiaTheme="minorEastAsia"/>
+        </w:rPr>
+        <w:t xml:space="preserve"> która nie jest elementem ciągu Fibonacciego, bierzemy </w:t>
+      </w:r>
+      <w:r>
+        <w:rPr>
+          <w:rFonts w:eastAsiaTheme="minorEastAsia"/>
+        </w:rPr>
+        <w:t>największą</w:t>
+      </w:r>
+      <w:r>
+        <w:rPr>
+          <w:rFonts w:eastAsiaTheme="minorEastAsia"/>
+        </w:rPr>
+        <w:t xml:space="preserve"> </w:t>
+      </w:r>
+      <w:r>
+        <w:rPr>
+          <w:rFonts w:eastAsiaTheme="minorEastAsia"/>
+        </w:rPr>
+        <w:t>mniejszą</w:t>
+      </w:r>
+      <w:r>
+        <w:rPr>
+          <w:rFonts w:eastAsiaTheme="minorEastAsia"/>
+        </w:rPr>
+        <w:t xml:space="preserve"> liczbę od 12, która jest w ciągu Fibonacciego, w tym przypadku </w:t>
+      </w:r>
+      <w:r>
+        <w:rPr>
+          <w:rFonts w:eastAsiaTheme="minorEastAsia"/>
+        </w:rPr>
+        <w:t>jest to 8. Możemy zapisać 12 jako 8+4</w:t>
+      </w:r>
+      <w:r>
+        <w:rPr>
+          <w:rFonts w:eastAsiaTheme="minorEastAsia"/>
+        </w:rPr>
+        <w:t xml:space="preserve">, ale idealny podział by był gdybyśmy mieli 8+5, gdyż to są dwie sąsiednie liczby z ciągu. Otóż okazuje się, że </w:t>
+      </w:r>
+      <w:r>
+        <w:rPr>
+          <w:rFonts w:eastAsiaTheme="minorEastAsia"/>
+        </w:rPr>
+        <w:t xml:space="preserve">brak jeden serii nie jest problemem, ponieważ możemy w pierwszej fazie „udawać”, że mamy 5 serii na </w:t>
+      </w:r>
+      <w:r>
+        <w:rPr>
+          <w:rFonts w:eastAsiaTheme="minorEastAsia"/>
+        </w:rPr>
+        <w:t>drugiej z tych taśm</w:t>
+      </w:r>
+      <w:r>
+        <w:rPr>
+          <w:rFonts w:eastAsiaTheme="minorEastAsia"/>
+        </w:rPr>
+        <w:t>.</w:t>
+      </w:r>
+      <w:r>
+        <w:rPr>
+          <w:rFonts w:eastAsiaTheme="minorEastAsia"/>
+        </w:rPr>
+        <w:t xml:space="preserve"> </w:t>
+      </w:r>
+    </w:p>
+    <w:p>
+      <w:pPr>
+        <w:rPr>
+          <w:rFonts w:eastAsiaTheme="minorEastAsia"/>
+        </w:rPr>
+      </w:pPr>
+      <w:r>
+        <w:rPr>
+          <w:rFonts w:eastAsiaTheme="minorEastAsia"/>
+        </w:rPr>
+        <w:t>Podczas scalania nie będziemy scalać 4 serii z obu taśm, lecz 5</w:t>
+      </w:r>
+      <w:r>
+        <w:rPr>
+          <w:rFonts w:eastAsiaTheme="minorEastAsia"/>
+        </w:rPr>
+        <w:t xml:space="preserve"> i skorzystamy z faktu, że podczas scalania </w:t>
+      </w:r>
+      <m:oMath>
+        <m:r>
+          <w:rPr>
+            <w:rFonts w:ascii="Cambria Math" w:eastAsiaTheme="minorEastAsia" w:hAnsi="Cambria Math"/>
+          </w:rPr>
+          <m:t>x</m:t>
+        </m:r>
+      </m:oMath>
+      <w:r>
+        <w:rPr>
+          <w:rFonts w:eastAsiaTheme="minorEastAsia"/>
+        </w:rPr>
+        <w:t xml:space="preserve"> serii z </w:t>
+      </w:r>
+      <m:oMath>
+        <m:r>
+          <w:rPr>
+            <w:rFonts w:ascii="Cambria Math" w:eastAsiaTheme="minorEastAsia" w:hAnsi="Cambria Math"/>
+          </w:rPr>
+          <m:t>y</m:t>
+        </m:r>
+      </m:oMath>
+      <w:r>
+        <w:rPr>
+          <w:rFonts w:eastAsiaTheme="minorEastAsia"/>
+        </w:rPr>
+        <w:t xml:space="preserve"> seriami otrzymujemy </w:t>
+      </w:r>
+      <m:oMath>
+        <m:r>
+          <w:rPr>
+            <w:rFonts w:ascii="Cambria Math" w:eastAsiaTheme="minorEastAsia" w:hAnsi="Cambria Math"/>
+          </w:rPr>
+          <m:t>max</m:t>
+        </m:r>
+        <m:d>
+          <m:dPr>
+            <m:ctrlPr>
+              <w:rPr>
+                <w:rFonts w:ascii="Cambria Math" w:eastAsiaTheme="minorEastAsia" w:hAnsi="Cambria Math"/>
+                <w:i/>
+              </w:rPr>
+            </m:ctrlPr>
+          </m:dPr>
+          <m:e>
+            <m:r>
+              <w:rPr>
+                <w:rFonts w:ascii="Cambria Math" w:eastAsiaTheme="minorEastAsia" w:hAnsi="Cambria Math"/>
+              </w:rPr>
+              <m:t>x, y</m:t>
+            </m:r>
+          </m:e>
+        </m:d>
+      </m:oMath>
+      <w:r>
+        <w:rPr>
+          <w:rFonts w:eastAsiaTheme="minorEastAsia"/>
+        </w:rPr>
+        <w:t xml:space="preserve"> serii. </w:t>
+      </w:r>
+      <w:r>
+        <w:rPr>
+          <w:rFonts w:eastAsiaTheme="minorEastAsia"/>
+        </w:rPr>
+        <w:t xml:space="preserve">Oznacza to, że jeżeli scalimy 5 serii z 4 seriami otrzymamy 5 serii (jedna seria bez pary po prostu zostanie przepisana w całości bez zmian). </w:t>
+      </w:r>
+      <w:r>
+        <w:rPr>
+          <w:rFonts w:eastAsiaTheme="minorEastAsia"/>
+        </w:rPr>
+        <w:t>W takiej sytuacji jak nasza dystrybucja na taśmach wynosiła 8 4 0, to po pierwszej fazie będzie 3 0 5 i już mamy liczby, które się zgadzają z ciągiem Fibonacciego.</w:t>
+      </w:r>
+    </w:p>
+    <w:p>
+      <w:pPr>
+        <w:rPr>
+          <w:rFonts w:eastAsiaTheme="minorEastAsia"/>
+        </w:rPr>
+      </w:pPr>
+    </w:p>
+    <w:p>
+      <w:pPr>
+        <w:rPr>
+          <w:rFonts w:eastAsiaTheme="minorEastAsia"/>
+          <w:b/>
+          <w:bCs/>
+          <w:sz w:val="32"/>
+          <w:szCs w:val="32"/>
+        </w:rPr>
+      </w:pPr>
+      <w:r>
+        <w:rPr>
+          <w:rFonts w:eastAsiaTheme="minorEastAsia"/>
+          <w:b/>
+          <w:bCs/>
+          <w:sz w:val="32"/>
+          <w:szCs w:val="32"/>
+        </w:rPr>
+        <w:t>3</w:t>
+      </w:r>
+      <w:r>
+        <w:rPr>
+          <w:rFonts w:eastAsiaTheme="minorEastAsia"/>
+          <w:b/>
+          <w:bCs/>
+          <w:sz w:val="32"/>
+          <w:szCs w:val="32"/>
+        </w:rPr>
+        <w:t>. Złożoność algorytmu</w:t>
+      </w:r>
+    </w:p>
+    <w:p>
+      <w:pPr>
+        <w:rPr>
+          <w:rFonts w:eastAsiaTheme="minorEastAsia"/>
+        </w:rPr>
+      </w:pPr>
+      <w:r>
+        <w:rPr>
+          <w:rFonts w:eastAsiaTheme="minorEastAsia"/>
+        </w:rPr>
+        <w:t>Oznaczenia:</w:t>
+      </w:r>
+    </w:p>
+    <w:p>
+      <w:pPr>
+        <w:numPr>
+          <w:ilvl w:val="0"/>
+          <w:numId w:val="7"/>
+        </w:numPr>
+        <w:rPr>
+          <w:rFonts w:eastAsiaTheme="minorEastAsia"/>
+        </w:rPr>
+      </w:pPr>
+      <m:oMath>
+        <m:r>
+          <w:rPr>
+            <w:rFonts w:ascii="Cambria Math" w:eastAsiaTheme="minorEastAsia" w:hAnsi="Cambria Math"/>
+          </w:rPr>
+          <m:t>N</m:t>
+        </m:r>
+      </m:oMath>
+      <w:r>
+        <w:rPr>
+          <w:rFonts w:eastAsiaTheme="minorEastAsia"/>
+        </w:rPr>
+        <w:t xml:space="preserve"> </w:t>
+      </w:r>
+      <w:r>
+        <w:rPr>
+          <w:rFonts w:eastAsiaTheme="minorEastAsia"/>
+        </w:rPr>
+        <w:t>– liczba rekordów w pliku,</w:t>
+      </w:r>
+    </w:p>
+    <w:p>
+      <w:pPr>
+        <w:numPr>
+          <w:ilvl w:val="0"/>
+          <w:numId w:val="7"/>
+        </w:numPr>
+        <w:rPr>
+          <w:rFonts w:eastAsiaTheme="minorEastAsia"/>
+        </w:rPr>
+      </w:pPr>
+      <m:oMath>
+        <m:r>
+          <w:rPr>
+            <w:rFonts w:ascii="Cambria Math" w:eastAsiaTheme="minorEastAsia" w:hAnsi="Cambria Math"/>
+          </w:rPr>
+          <m:t>r</m:t>
+        </m:r>
+      </m:oMath>
+      <w:r>
+        <w:rPr>
+          <w:rFonts w:eastAsiaTheme="minorEastAsia"/>
+        </w:rPr>
+        <w:t xml:space="preserve"> –</w:t>
+      </w:r>
+      <w:r>
+        <w:rPr>
+          <w:rFonts w:eastAsiaTheme="minorEastAsia"/>
+        </w:rPr>
+        <w:t xml:space="preserve"> początkowa</w:t>
+      </w:r>
+      <w:r>
+        <w:rPr>
+          <w:rFonts w:eastAsiaTheme="minorEastAsia"/>
+        </w:rPr>
+        <w:t xml:space="preserve"> liczba seri</w:t>
+      </w:r>
+      <w:r>
+        <w:rPr>
+          <w:rFonts w:eastAsiaTheme="minorEastAsia"/>
+        </w:rPr>
+        <w:t>i w pliku</w:t>
+      </w:r>
+      <w:r>
+        <w:rPr>
+          <w:rFonts w:eastAsiaTheme="minorEastAsia"/>
+        </w:rPr>
+        <w:t>,</w:t>
+      </w:r>
+    </w:p>
+    <w:p>
+      <w:pPr>
+        <w:numPr>
+          <w:ilvl w:val="0"/>
+          <w:numId w:val="7"/>
+        </w:numPr>
+        <w:rPr>
+          <w:rFonts w:eastAsiaTheme="minorEastAsia"/>
+        </w:rPr>
+      </w:pPr>
+      <m:oMath>
+        <m:r>
+          <w:rPr>
+            <w:rFonts w:ascii="Cambria Math" w:eastAsiaTheme="minorEastAsia" w:hAnsi="Cambria Math"/>
+          </w:rPr>
+          <m:t>b</m:t>
+        </m:r>
+      </m:oMath>
+      <w:r>
+        <w:rPr>
+          <w:rFonts w:eastAsiaTheme="minorEastAsia"/>
+        </w:rPr>
+        <w:t xml:space="preserve"> – współczynnik blokowania (liczba rekordów w jednym bloku)</w:t>
+      </w:r>
+      <w:r>
+        <w:rPr>
+          <w:rFonts w:eastAsiaTheme="minorEastAsia"/>
+        </w:rPr>
+        <w:t>,</w:t>
+      </w:r>
+    </w:p>
+    <w:p>
+      <w:pPr>
+        <w:numPr>
+          <w:ilvl w:val="0"/>
+          <w:numId w:val="7"/>
+        </w:numPr>
+        <w:rPr>
+          <w:rFonts w:eastAsiaTheme="minorEastAsia"/>
+        </w:rPr>
+      </w:pPr>
+      <m:oMath>
+        <m:r>
+          <w:rPr>
+            <w:rFonts w:ascii="Cambria Math" w:eastAsiaTheme="minorEastAsia" w:hAnsi="Cambria Math"/>
+          </w:rPr>
+          <m:t>ϕ</m:t>
+        </m:r>
+      </m:oMath>
+      <w:r>
+        <w:rPr>
+          <w:rFonts w:eastAsiaTheme="minorEastAsia"/>
+        </w:rPr>
+        <w:t xml:space="preserve"> </w:t>
+      </w:r>
+      <w:r>
+        <w:rPr>
+          <w:rFonts w:eastAsiaTheme="minorEastAsia"/>
+        </w:rPr>
+        <w:t>–</w:t>
+      </w:r>
+      <w:r>
+        <w:rPr>
+          <w:rFonts w:eastAsiaTheme="minorEastAsia"/>
+        </w:rPr>
+        <w:t xml:space="preserve"> </w:t>
+      </w:r>
+      <w:r>
+        <w:rPr>
+          <w:rFonts w:eastAsiaTheme="minorEastAsia"/>
+        </w:rPr>
+        <w:t>złot</w:t>
+      </w:r>
+      <w:r>
+        <w:rPr>
+          <w:rFonts w:eastAsiaTheme="minorEastAsia"/>
+        </w:rPr>
+        <w:t xml:space="preserve">a liczba </w:t>
+      </w:r>
+      <m:oMath>
+        <m:d>
+          <m:dPr>
+            <m:ctrlPr>
+              <w:rPr>
+                <w:rFonts w:ascii="Cambria Math" w:eastAsiaTheme="minorEastAsia" w:hAnsi="Cambria Math"/>
+                <w:i/>
+              </w:rPr>
+            </m:ctrlPr>
+          </m:dPr>
+          <m:e>
+            <m:f>
+              <m:fPr>
+                <m:ctrlPr>
+                  <w:rPr>
+                    <w:rFonts w:ascii="Cambria Math" w:eastAsiaTheme="minorEastAsia" w:hAnsi="Cambria Math"/>
+                    <w:i/>
+                  </w:rPr>
+                </m:ctrlPr>
+              </m:fPr>
+              <m:num>
+                <m:r>
+                  <w:rPr>
+                    <w:rFonts w:ascii="Cambria Math" w:eastAsiaTheme="minorEastAsia" w:hAnsi="Cambria Math"/>
+                  </w:rPr>
+                  <m:t>1+</m:t>
+                </m:r>
+                <m:rad>
+                  <m:radPr>
+                    <m:degHide m:val="1"/>
+                    <m:ctrlPr>
+                      <w:rPr>
+                        <w:rFonts w:ascii="Cambria Math" w:eastAsiaTheme="minorEastAsia" w:hAnsi="Cambria Math"/>
+                        <w:i/>
+                      </w:rPr>
+                    </m:ctrlPr>
+                  </m:radPr>
+                  <m:deg/>
+                  <m:e>
+                    <m:r>
+                      <w:rPr>
+                        <w:rFonts w:ascii="Cambria Math" w:eastAsiaTheme="minorEastAsia" w:hAnsi="Cambria Math"/>
+                      </w:rPr>
+                      <m:t>5</m:t>
+                    </m:r>
+                  </m:e>
+                </m:rad>
+              </m:num>
+              <m:den>
+                <m:r>
+                  <w:rPr>
+                    <w:rFonts w:ascii="Cambria Math" w:eastAsiaTheme="minorEastAsia" w:hAnsi="Cambria Math"/>
+                  </w:rPr>
+                  <m:t>2</m:t>
+                </m:r>
+              </m:den>
+            </m:f>
+          </m:e>
+        </m:d>
+      </m:oMath>
+      <w:r>
+        <w:rPr>
+          <w:rFonts w:eastAsiaTheme="minorEastAsia"/>
+        </w:rPr>
+        <w:t>.</w:t>
+      </w:r>
+    </w:p>
+    <w:p>
+      <w:pPr>
+        <w:numPr>
+          <w:ilvl w:val="0"/>
+          <w:numId w:val="7"/>
+        </w:numPr>
+        <w:rPr>
+          <w:rFonts w:eastAsiaTheme="minorEastAsia"/>
+        </w:rPr>
+      </w:pPr>
+      <m:oMath>
+        <m:r>
+          <w:rPr>
+            <w:rFonts w:ascii="Cambria Math" w:eastAsiaTheme="minorEastAsia" w:hAnsi="Cambria Math"/>
+          </w:rPr>
+          <m:t>k</m:t>
+        </m:r>
+      </m:oMath>
+      <w:r>
+        <w:rPr>
+          <w:rFonts w:eastAsiaTheme="minorEastAsia"/>
+        </w:rPr>
+        <w:t xml:space="preserve"> – liczba faz</w:t>
+      </w:r>
+    </w:p>
+    <w:p>
+      <w:pPr>
+        <w:rPr>
+          <w:rFonts w:eastAsiaTheme="minorEastAsia"/>
+        </w:rPr>
+      </w:pPr>
+    </w:p>
+    <w:p>
+      <w:pPr>
+        <w:rPr>
+          <w:rFonts w:eastAsiaTheme="minorEastAsia"/>
+          <w:b/>
+          <w:bCs/>
+          <w:sz w:val="28"/>
+          <w:szCs w:val="28"/>
+        </w:rPr>
+      </w:pPr>
+      <w:r>
+        <w:rPr>
+          <w:rFonts w:eastAsiaTheme="minorEastAsia"/>
+          <w:b/>
+          <w:bCs/>
+          <w:sz w:val="28"/>
+          <w:szCs w:val="28"/>
+        </w:rPr>
+        <w:t>3.1. Liczba faz</w:t>
+      </w:r>
+    </w:p>
+    <w:p>
+      <w:pPr>
+        <w:rPr>
+          <w:rFonts w:eastAsiaTheme="minorEastAsia"/>
+        </w:rPr>
+      </w:pPr>
+      <w:r>
+        <w:rPr>
+          <w:rFonts w:eastAsiaTheme="minorEastAsia"/>
+        </w:rPr>
+        <w:t xml:space="preserve">Ustaliliśmy już wcześniej, że to </w:t>
+      </w:r>
+      <w:r>
+        <w:rPr>
+          <w:rFonts w:eastAsiaTheme="minorEastAsia"/>
+        </w:rPr>
+        <w:t>jak blisko jest nasza początkowa ilość serii</w:t>
+      </w:r>
+      <w:r>
+        <w:rPr>
+          <w:rFonts w:eastAsiaTheme="minorEastAsia"/>
+        </w:rPr>
+        <w:t xml:space="preserve"> do danej liczby z ciągu Fibonacciego </w:t>
+      </w:r>
+      <w:r>
+        <w:rPr>
+          <w:rFonts w:eastAsiaTheme="minorEastAsia"/>
+        </w:rPr>
+        <w:t xml:space="preserve">jest ściśle powiązane z długością serii podczas sortowania. Gdyż po każdej fazie </w:t>
+      </w:r>
+      <w:r>
+        <w:rPr>
+          <w:rFonts w:eastAsiaTheme="minorEastAsia"/>
+        </w:rPr>
+        <w:t xml:space="preserve">sumaryczna ilość serii </w:t>
+      </w:r>
+      <w:r>
+        <w:rPr>
+          <w:rFonts w:eastAsiaTheme="minorEastAsia"/>
+        </w:rPr>
+        <w:t xml:space="preserve">zamienia się z </w:t>
+      </w:r>
+      <m:oMath>
+        <m:sSub>
+          <m:sSubPr>
+            <m:ctrlPr>
+              <w:rPr>
+                <w:rFonts w:ascii="Cambria Math" w:eastAsiaTheme="minorEastAsia" w:hAnsi="Cambria Math"/>
+                <w:i/>
+              </w:rPr>
+            </m:ctrlPr>
+          </m:sSubPr>
+          <m:e>
+            <m:r>
+              <w:rPr>
+                <w:rFonts w:ascii="Cambria Math" w:eastAsiaTheme="minorEastAsia" w:hAnsi="Cambria Math"/>
+              </w:rPr>
+              <m:t>F</m:t>
+            </m:r>
+          </m:e>
+          <m:sub>
+            <m:r>
+              <w:rPr>
+                <w:rFonts w:ascii="Cambria Math" w:eastAsiaTheme="minorEastAsia" w:hAnsi="Cambria Math"/>
+              </w:rPr>
+              <m:t>n</m:t>
+            </m:r>
+          </m:sub>
+        </m:sSub>
+      </m:oMath>
+      <w:r>
+        <w:rPr>
+          <w:rFonts w:eastAsiaTheme="minorEastAsia"/>
+        </w:rPr>
+        <w:t xml:space="preserve"> na </w:t>
+      </w:r>
+      <m:oMath>
+        <m:sSub>
+          <m:sSubPr>
+            <m:ctrlPr>
+              <w:rPr>
+                <w:rFonts w:ascii="Cambria Math" w:eastAsiaTheme="minorEastAsia" w:hAnsi="Cambria Math"/>
+                <w:i/>
+              </w:rPr>
+            </m:ctrlPr>
+          </m:sSubPr>
+          <m:e>
+            <m:r>
+              <w:rPr>
+                <w:rFonts w:ascii="Cambria Math" w:eastAsiaTheme="minorEastAsia" w:hAnsi="Cambria Math"/>
+              </w:rPr>
+              <m:t>F</m:t>
+            </m:r>
+          </m:e>
+          <m:sub>
+            <m:r>
+              <w:rPr>
+                <w:rFonts w:ascii="Cambria Math" w:eastAsiaTheme="minorEastAsia" w:hAnsi="Cambria Math"/>
+              </w:rPr>
+              <m:t>n-1</m:t>
+            </m:r>
+          </m:sub>
+        </m:sSub>
+      </m:oMath>
+      <w:r>
+        <w:rPr>
+          <w:rFonts w:eastAsiaTheme="minorEastAsia"/>
+        </w:rPr>
+        <w:t xml:space="preserve">. A że </w:t>
+      </w:r>
+      <w:r>
+        <w:rPr>
+          <w:rFonts w:eastAsiaTheme="minorEastAsia"/>
+        </w:rPr>
+        <w:t xml:space="preserve">naszym celem jest dotarcie do </w:t>
+      </w:r>
+      <w:r>
+        <w:rPr>
+          <w:rFonts w:eastAsiaTheme="minorEastAsia"/>
+        </w:rPr>
+        <w:t>1 (</w:t>
+      </w:r>
+      <m:oMath>
+        <m:sSub>
+          <m:sSubPr>
+            <m:ctrlPr>
+              <w:rPr>
+                <w:rFonts w:ascii="Cambria Math" w:eastAsiaTheme="minorEastAsia" w:hAnsi="Cambria Math"/>
+                <w:i/>
+              </w:rPr>
+            </m:ctrlPr>
+          </m:sSubPr>
+          <m:e>
+            <m:r>
+              <w:rPr>
+                <w:rFonts w:ascii="Cambria Math" w:eastAsiaTheme="minorEastAsia" w:hAnsi="Cambria Math"/>
+              </w:rPr>
+              <m:t>F</m:t>
+            </m:r>
+          </m:e>
+          <m:sub>
+            <m:r>
+              <w:rPr>
+                <w:rFonts w:ascii="Cambria Math" w:eastAsiaTheme="minorEastAsia" w:hAnsi="Cambria Math"/>
+              </w:rPr>
+              <m:t>1</m:t>
+            </m:r>
+          </m:sub>
+        </m:sSub>
+      </m:oMath>
+      <w:r>
+        <w:rPr>
+          <w:rFonts w:eastAsiaTheme="minorEastAsia"/>
+        </w:rPr>
+        <w:t xml:space="preserve">), to możemy zaokrąglić ilość faz do </w:t>
+      </w:r>
+      <m:oMath>
+        <m:r>
+          <w:rPr>
+            <w:rFonts w:ascii="Cambria Math" w:eastAsiaTheme="minorEastAsia" w:hAnsi="Cambria Math"/>
+          </w:rPr>
+          <m:t>n</m:t>
+        </m:r>
+      </m:oMath>
+      <w:r>
+        <w:rPr>
+          <w:rFonts w:eastAsiaTheme="minorEastAsia"/>
+        </w:rPr>
+        <w:t xml:space="preserve"> przy </w:t>
+      </w:r>
+      <m:oMath>
+        <m:sSub>
+          <m:sSubPr>
+            <m:ctrlPr>
+              <w:rPr>
+                <w:rFonts w:ascii="Cambria Math" w:eastAsiaTheme="minorEastAsia" w:hAnsi="Cambria Math"/>
+                <w:i/>
+              </w:rPr>
+            </m:ctrlPr>
+          </m:sSubPr>
+          <m:e>
+            <m:r>
+              <w:rPr>
+                <w:rFonts w:ascii="Cambria Math" w:eastAsiaTheme="minorEastAsia" w:hAnsi="Cambria Math"/>
+              </w:rPr>
+              <m:t>F</m:t>
+            </m:r>
+          </m:e>
+          <m:sub>
+            <m:r>
+              <w:rPr>
+                <w:rFonts w:ascii="Cambria Math" w:eastAsiaTheme="minorEastAsia" w:hAnsi="Cambria Math"/>
+              </w:rPr>
+              <m:t>n</m:t>
+            </m:r>
+          </m:sub>
+        </m:sSub>
+      </m:oMath>
+      <w:r>
+        <w:rPr>
+          <w:rFonts w:eastAsiaTheme="minorEastAsia"/>
+        </w:rPr>
+        <w:t xml:space="preserve"> początkowych seriach.</w:t>
+      </w:r>
+    </w:p>
+    <w:p>
+      <w:pPr>
+        <w:rPr>
+          <w:rFonts w:eastAsiaTheme="minorEastAsia"/>
+        </w:rPr>
+      </w:pPr>
+      <w:r>
+        <w:rPr>
+          <w:rFonts w:eastAsiaTheme="minorEastAsia"/>
+        </w:rPr>
+        <w:t xml:space="preserve">Teraz pojawia się pytanie, jak określić, którą liczbą z ciągu Fibonacciego jest nasza liczba serii. Do określenia tego możemy wykorzystać </w:t>
+      </w:r>
+      <w:r>
+        <w:rPr>
+          <w:rFonts w:eastAsiaTheme="minorEastAsia"/>
+        </w:rPr>
+        <w:t xml:space="preserve">wzór </w:t>
+      </w:r>
+      <w:proofErr w:type="spellStart"/>
+      <w:r>
+        <w:rPr>
+          <w:rFonts w:eastAsiaTheme="minorEastAsia"/>
+        </w:rPr>
+        <w:t>Bineta</w:t>
+      </w:r>
+      <w:proofErr w:type="spellEnd"/>
+      <w:r>
+        <w:rPr>
+          <w:rFonts w:eastAsiaTheme="minorEastAsia"/>
+        </w:rPr>
+        <w:t>:</w:t>
+      </w:r>
+    </w:p>
     <w:p>
       <w:pPr>
         <w:rPr>
@@ -240,13 +1816,7 @@
                         <w:rPr>
                           <w:rFonts w:ascii="Cambria Math" w:hAnsi="Cambria Math"/>
                         </w:rPr>
-                        <m:t>1</m:t>
-                      </m:r>
-                      <m:r>
-                        <w:rPr>
-                          <w:rFonts w:ascii="Cambria Math" w:hAnsi="Cambria Math"/>
-                        </w:rPr>
-                        <m:t>-</m:t>
+                        <m:t>1-</m:t>
                       </m:r>
                       <m:rad>
                         <m:radPr>
@@ -303,7 +1873,19 @@
         <w:rPr>
           <w:rFonts w:eastAsiaTheme="minorEastAsia"/>
         </w:rPr>
-        <w:t>Ponieważ drugi człon tego wyrażenia szybko zbiera do zera, można przybliżyć to do:</w:t>
+        <w:t xml:space="preserve">Ponieważ drugi człon tego wyrażenia szybko zbiera do zera, można przybliżyć </w:t>
+      </w:r>
+      <w:r>
+        <w:rPr>
+          <w:rFonts w:eastAsiaTheme="minorEastAsia"/>
+        </w:rPr>
+        <w:t>go</w:t>
+      </w:r>
+      <w:r>
+        <w:rPr>
+          <w:rFonts w:eastAsiaTheme="minorEastAsia"/>
+        </w:rPr>
+        <w:t xml:space="preserve"> do:</w:t>
       </w:r>
     </w:p>
     <w:p>
@@ -543,7 +2125,67 @@
         <w:rPr>
           <w:rFonts w:eastAsiaTheme="minorEastAsia"/>
         </w:rPr>
-        <w:t>Skoro liczba faz (k) to w przybliżeniu nr liczby Fibonacciego, która odpowiada naszej ilości run (r), to:</w:t>
+        <w:t xml:space="preserve">Skoro </w:t>
+      </w:r>
+      <w:r>
+        <w:rPr>
+          <w:rFonts w:eastAsiaTheme="minorEastAsia"/>
+        </w:rPr>
+        <w:t xml:space="preserve">w naszym przypadku </w:t>
+      </w:r>
+      <m:oMath>
+        <m:r>
+          <w:rPr>
+            <w:rFonts w:ascii="Cambria Math" w:eastAsiaTheme="minorEastAsia" w:hAnsi="Cambria Math"/>
+          </w:rPr>
+          <m:t>r=</m:t>
+        </m:r>
+        <m:sSub>
+          <m:sSubPr>
+            <m:ctrlPr>
+              <w:rPr>
+                <w:rFonts w:ascii="Cambria Math" w:eastAsiaTheme="minorEastAsia" w:hAnsi="Cambria Math"/>
+                <w:i/>
+              </w:rPr>
+            </m:ctrlPr>
+          </m:sSubPr>
+          <m:e>
+            <m:r>
+              <w:rPr>
+                <w:rFonts w:ascii="Cambria Math" w:eastAsiaTheme="minorEastAsia" w:hAnsi="Cambria Math"/>
+              </w:rPr>
+              <m:t>F</m:t>
+            </m:r>
+          </m:e>
+          <m:sub>
+            <m:r>
+              <w:rPr>
+                <w:rFonts w:ascii="Cambria Math" w:eastAsiaTheme="minorEastAsia" w:hAnsi="Cambria Math"/>
+              </w:rPr>
+              <m:t>n</m:t>
+            </m:r>
+          </m:sub>
+        </m:sSub>
+      </m:oMath>
+      <w:r>
+        <w:rPr>
+          <w:rFonts w:eastAsiaTheme="minorEastAsia"/>
+        </w:rPr>
+        <w:t xml:space="preserve">, a </w:t>
+      </w:r>
+      <m:oMath>
+        <m:r>
+          <w:rPr>
+            <w:rFonts w:ascii="Cambria Math" w:eastAsiaTheme="minorEastAsia" w:hAnsi="Cambria Math"/>
+          </w:rPr>
+          <m:t>k</m:t>
+        </m:r>
+      </m:oMath>
+      <w:r>
+        <w:rPr>
+          <w:rFonts w:eastAsiaTheme="minorEastAsia"/>
+        </w:rPr>
+        <w:t xml:space="preserve"> to liczba faz, to możemy zamienić ten wzór na:</w:t>
       </w:r>
     </w:p>
     <w:p>
@@ -558,13 +2200,8 @@
             <w:rPr>
               <w:rFonts w:ascii="Cambria Math" w:hAnsi="Cambria Math"/>
             </w:rPr>
-            <m:t>r</m:t>
-          </m:r>
-          <m:r>
-            <w:rPr>
-              <w:rFonts w:ascii="Cambria Math" w:hAnsi="Cambria Math"/>
-            </w:rPr>
-            <m:t>=</m:t>
+            <w:lastRenderedPageBreak/>
+            <m:t>r=</m:t>
           </m:r>
           <m:f>
             <m:fPr>
@@ -627,6 +2264,9 @@
             </m:den>
           </m:f>
           <m:r>
+            <m:rPr>
+              <m:sty m:val="p"/>
+            </m:rPr>
             <w:rPr>
               <w:rFonts w:ascii="Cambria Math" w:hAnsi="Cambria Math"/>
             </w:rPr>
@@ -693,6 +2333,9 @@
             <m:t>r</m:t>
           </m:r>
           <m:r>
+            <m:rPr>
+              <m:sty m:val="p"/>
+            </m:rPr>
             <w:rPr>
               <w:rFonts w:ascii="Cambria Math" w:hAnsi="Cambria Math"/>
             </w:rPr>
@@ -776,6 +2419,9 @@
             </m:e>
           </m:func>
           <m:r>
+            <m:rPr>
+              <m:sty m:val="p"/>
+            </m:rPr>
             <w:rPr>
               <w:rFonts w:ascii="Cambria Math" w:eastAsiaTheme="minorEastAsia" w:hAnsi="Cambria Math"/>
             </w:rPr>
@@ -1005,7 +2651,19 @@
         <w:rPr>
           <w:rFonts w:eastAsiaTheme="minorEastAsia"/>
         </w:rPr>
-        <w:t>) i usunięcie jej ułatwi obliczenia.</w:t>
+        <w:t xml:space="preserve">) i usunięcie jej ułatwi </w:t>
+      </w:r>
+      <w:r>
+        <w:rPr>
+          <w:rFonts w:eastAsiaTheme="minorEastAsia"/>
+        </w:rPr>
+        <w:t xml:space="preserve">późniejsze </w:t>
+      </w:r>
+      <w:r>
+        <w:rPr>
+          <w:rFonts w:eastAsiaTheme="minorEastAsia"/>
+        </w:rPr>
+        <w:t>obliczenia.</w:t>
       </w:r>
     </w:p>
     <w:p>
@@ -1072,6 +2730,9 @@
             </m:e>
           </m:func>
           <m:r>
+            <m:rPr>
+              <m:sty m:val="p"/>
+            </m:rPr>
             <w:rPr>
               <w:rFonts w:ascii="Cambria Math" w:eastAsiaTheme="minorEastAsia" w:hAnsi="Cambria Math"/>
             </w:rPr>
@@ -1198,6 +2859,9 @@
             </m:den>
           </m:f>
           <m:r>
+            <m:rPr>
+              <m:sty m:val="p"/>
+            </m:rPr>
             <w:rPr>
               <w:rFonts w:ascii="Cambria Math" w:eastAsiaTheme="minorEastAsia" w:hAnsi="Cambria Math"/>
             </w:rPr>
@@ -1342,13 +3006,78 @@
       <w:pPr>
         <w:rPr>
           <w:rFonts w:eastAsiaTheme="minorEastAsia"/>
-        </w:rPr>
-      </w:pPr>
-      <w:r>
-        <w:rPr>
-          <w:rFonts w:eastAsiaTheme="minorEastAsia"/>
-        </w:rPr>
-        <w:t>Wiemy już ile mam faz scalania taśm, ale pytanie, ile rekordów bierze udział w pojedynczej fazie, ponieważ nie wykorzystujemy wszystkich rekordów.</w:t>
+          <w:b/>
+          <w:bCs/>
+          <w:sz w:val="28"/>
+          <w:szCs w:val="28"/>
+        </w:rPr>
+      </w:pPr>
+      <w:r>
+        <w:rPr>
+          <w:rFonts w:eastAsiaTheme="minorEastAsia"/>
+          <w:b/>
+          <w:bCs/>
+          <w:sz w:val="28"/>
+          <w:szCs w:val="28"/>
+        </w:rPr>
+        <w:t>3.2. Udział rekordów w scalaniu</w:t>
+      </w:r>
+    </w:p>
+    <w:p>
+      <w:pPr>
+        <w:rPr>
+          <w:rFonts w:eastAsiaTheme="minorEastAsia"/>
+        </w:rPr>
+      </w:pPr>
+      <w:r>
+        <w:rPr>
+          <w:rFonts w:eastAsiaTheme="minorEastAsia"/>
+        </w:rPr>
+        <w:t xml:space="preserve">Wiemy </w:t>
+      </w:r>
+      <w:proofErr w:type="gramStart"/>
+      <w:r>
+        <w:rPr>
+          <w:rFonts w:eastAsiaTheme="minorEastAsia"/>
+        </w:rPr>
+        <w:t>już</w:t>
+      </w:r>
+      <w:proofErr w:type="gramEnd"/>
+      <w:r>
+        <w:rPr>
+          <w:rFonts w:eastAsiaTheme="minorEastAsia"/>
+        </w:rPr>
+        <w:t xml:space="preserve"> ile mam faz scalania taśm, ale pytanie, ile rekordów bierze udział w pojedynczej fazie, ponieważ </w:t>
+      </w:r>
+      <w:r>
+        <w:rPr>
+          <w:rFonts w:eastAsiaTheme="minorEastAsia"/>
+        </w:rPr>
+        <w:t xml:space="preserve">w przeciwieństwie do scalania </w:t>
+      </w:r>
+      <w:r>
+        <w:rPr>
+          <w:rFonts w:eastAsiaTheme="minorEastAsia"/>
+        </w:rPr>
+        <w:t xml:space="preserve">naturalnego, </w:t>
+      </w:r>
+      <w:r>
+        <w:rPr>
+          <w:rFonts w:eastAsiaTheme="minorEastAsia"/>
+        </w:rPr>
+        <w:t>nie wykorzystujemy wszystkich rekordów</w:t>
+      </w:r>
+      <w:r>
+        <w:rPr>
+          <w:rFonts w:eastAsiaTheme="minorEastAsia"/>
+        </w:rPr>
+        <w:t xml:space="preserve"> przy scalaniu</w:t>
+      </w:r>
+      <w:r>
+        <w:rPr>
+          <w:rFonts w:eastAsiaTheme="minorEastAsia"/>
+        </w:rPr>
+        <w:t>.</w:t>
       </w:r>
     </w:p>
     <w:p>
@@ -1375,7 +3104,19 @@
         <w:rPr>
           <w:rFonts w:eastAsiaTheme="minorEastAsia"/>
         </w:rPr>
-        <w:t xml:space="preserve"> serii oraz każda seria ma około </w:t>
+        <w:t xml:space="preserve"> serii oraz każda seria ma </w:t>
+      </w:r>
+      <w:r>
+        <w:rPr>
+          <w:rFonts w:eastAsiaTheme="minorEastAsia"/>
+        </w:rPr>
+        <w:t>średnio</w:t>
+      </w:r>
+      <w:r>
+        <w:rPr>
+          <w:rFonts w:eastAsiaTheme="minorEastAsia"/>
+        </w:rPr>
+        <w:t xml:space="preserve"> </w:t>
       </w:r>
       <m:oMath>
         <m:r>
@@ -1801,6 +3542,34 @@
           <w:rFonts w:eastAsiaTheme="minorEastAsia"/>
         </w:rPr>
       </w:pPr>
+    </w:p>
+    <w:p>
+      <w:pPr>
+        <w:rPr>
+          <w:rFonts w:eastAsiaTheme="minorEastAsia"/>
+          <w:b/>
+          <w:bCs/>
+          <w:sz w:val="28"/>
+          <w:szCs w:val="28"/>
+        </w:rPr>
+      </w:pPr>
+      <w:r>
+        <w:rPr>
+          <w:rFonts w:eastAsiaTheme="minorEastAsia"/>
+          <w:b/>
+          <w:bCs/>
+          <w:sz w:val="28"/>
+          <w:szCs w:val="28"/>
+        </w:rPr>
+        <w:t>3.3. Liczba operacji dyskowych</w:t>
+      </w:r>
+    </w:p>
+    <w:p>
+      <w:pPr>
+        <w:rPr>
+          <w:rFonts w:eastAsiaTheme="minorEastAsia"/>
+        </w:rPr>
+      </w:pPr>
       <w:r>
         <w:rPr>
           <w:rFonts w:eastAsiaTheme="minorEastAsia"/>
@@ -1820,13 +3589,7 @@
             <w:rPr>
               <w:rFonts w:ascii="Cambria Math" w:eastAsiaTheme="minorEastAsia" w:hAnsi="Cambria Math"/>
             </w:rPr>
-            <m:t>N* 0.72*</m:t>
-          </m:r>
-          <m:r>
-            <w:rPr>
-              <w:rFonts w:ascii="Cambria Math" w:eastAsiaTheme="minorEastAsia" w:hAnsi="Cambria Math"/>
-            </w:rPr>
-            <m:t>1.44</m:t>
+            <m:t>N* 0.72*1.44</m:t>
           </m:r>
           <m:func>
             <m:funcPr>
@@ -1959,14 +3722,7 @@
         <w:rPr>
           <w:rFonts w:eastAsiaTheme="minorEastAsia"/>
         </w:rPr>
-        <w:t xml:space="preserve"> rekordów. Dodatkowo przy każdej fazie każdy rekord, który </w:t>
-      </w:r>
-      <w:r>
-        <w:rPr>
-          <w:rFonts w:eastAsiaTheme="minorEastAsia"/>
-        </w:rPr>
-        <w:lastRenderedPageBreak/>
-        <w:t>uczestniczy w scalaniu jest odczytywany i zapisywany, więc wykonujemy na nim dwie operacje. Biorąc te dwa fakty pod uwagę moż</w:t>
+        <w:t xml:space="preserve"> rekordów. Dodatkowo przy każdej fazie każdy rekord, który uczestniczy w scalaniu jest odczytywany i zapisywany, więc wykonujemy na nim dwie operacje. Biorąc te dwa fakty pod uwagę moż</w:t>
       </w:r>
       <w:r>
         <w:rPr>
@@ -2358,7 +4114,712 @@
 </file>
 
 <file path=word/numbering.xml><?xml version="1.0" encoding="utf-8"?>
-<w:numbering xmlns:wpc="http://schemas.microsoft.com/office/word/2010/wordprocessingCanvas" xmlns:cx="http://schemas.microsoft.com/office/drawing/2014/chartex" xmlns:cx1="http://schemas.microsoft.com/office/drawing/2015/9/8/chartex" xmlns:cx2="http://schemas.microsoft.com/office/drawing/2015/10/21/chartex" xmlns:cx3="http://schemas.microsoft.com/office/drawing/2016/5/9/chartex" xmlns:cx4="http://schemas.microsoft.com/office/drawing/2016/5/10/chartex" xmlns:cx5="http://schemas.microsoft.com/office/drawing/2016/5/11/chartex" xmlns:cx6="http://schemas.microsoft.com/office/drawing/2016/5/12/chartex" xmlns:cx7="http://schemas.microsoft.com/office/drawing/2016/5/13/chartex" xmlns:cx8="http://schemas.microsoft.com/office/drawing/2016/5/14/chartex" xmlns:mc="http://schemas.openxmlformats.org/markup-compatibility/2006" xmlns:aink="http://schemas.microsoft.com/office/drawing/2016/ink" xmlns:am3d="http://schemas.microsoft.com/office/drawing/2017/model3d" xmlns:o="urn:schemas-microsoft-com:office:office" xmlns:oel="http://schemas.microsoft.com/office/2019/extlst" xmlns:r="http://schemas.openxmlformats.org/officeDocument/2006/relationships" xmlns:m="http://schemas.openxmlformats.org/officeDocument/2006/math" xmlns:v="urn:schemas-microsoft-com:vml" xmlns:wp14="http://schemas.microsoft.com/office/word/2010/wordprocessingDrawing" xmlns:wp="http://schemas.openxmlformats.org/drawingml/2006/wordprocessingDrawing" xmlns:w10="urn:schemas-microsoft-com:office:word" xmlns:w="http://schemas.openxmlformats.org/wordprocessingml/2006/main" xmlns:w14="http://schemas.microsoft.com/office/word/2010/wordml" xmlns:w15="http://schemas.microsoft.com/office/word/2012/wordml" xmlns:w16cex="http://schemas.microsoft.com/office/word/2018/wordml/cex" xmlns:w16cid="http://schemas.microsoft.com/office/word/2016/wordml/cid" xmlns:w16="http://schemas.microsoft.com/office/word/2018/wordml" xmlns:w16du="http://schemas.microsoft.com/office/word/2023/wordml/word16du" xmlns:w16sdtdh="http://schemas.microsoft.com/office/word/2020/wordml/sdtdatahash" xmlns:w16sdtfl="http://schemas.microsoft.com/office/word/2024/wordml/sdtformatlock" xmlns:w16se="http://schemas.microsoft.com/office/word/2015/wordml/symex" xmlns:wpg="http://schemas.microsoft.com/office/word/2010/wordprocessingGroup" xmlns:wpi="http://schemas.microsoft.com/office/word/2010/wordprocessingInk" xmlns:wne="http://schemas.microsoft.com/office/word/2006/wordml" xmlns:wps="http://schemas.microsoft.com/office/word/2010/wordprocessingShape" mc:Ignorable="w14 w15 w16se w16cid w16 w16cex w16sdtdh w16sdtfl w16du wp14"/>
+<w:numbering xmlns:wpc="http://schemas.microsoft.com/office/word/2010/wordprocessingCanvas" xmlns:cx="http://schemas.microsoft.com/office/drawing/2014/chartex" xmlns:cx1="http://schemas.microsoft.com/office/drawing/2015/9/8/chartex" xmlns:cx2="http://schemas.microsoft.com/office/drawing/2015/10/21/chartex" xmlns:cx3="http://schemas.microsoft.com/office/drawing/2016/5/9/chartex" xmlns:cx4="http://schemas.microsoft.com/office/drawing/2016/5/10/chartex" xmlns:cx5="http://schemas.microsoft.com/office/drawing/2016/5/11/chartex" xmlns:cx6="http://schemas.microsoft.com/office/drawing/2016/5/12/chartex" xmlns:cx7="http://schemas.microsoft.com/office/drawing/2016/5/13/chartex" xmlns:cx8="http://schemas.microsoft.com/office/drawing/2016/5/14/chartex" xmlns:mc="http://schemas.openxmlformats.org/markup-compatibility/2006" xmlns:aink="http://schemas.microsoft.com/office/drawing/2016/ink" xmlns:am3d="http://schemas.microsoft.com/office/drawing/2017/model3d" xmlns:o="urn:schemas-microsoft-com:office:office" xmlns:oel="http://schemas.microsoft.com/office/2019/extlst" xmlns:r="http://schemas.openxmlformats.org/officeDocument/2006/relationships" xmlns:m="http://schemas.openxmlformats.org/officeDocument/2006/math" xmlns:v="urn:schemas-microsoft-com:vml" xmlns:wp14="http://schemas.microsoft.com/office/word/2010/wordprocessingDrawing" xmlns:wp="http://schemas.openxmlformats.org/drawingml/2006/wordprocessingDrawing" xmlns:w10="urn:schemas-microsoft-com:office:word" xmlns:w="http://schemas.openxmlformats.org/wordprocessingml/2006/main" xmlns:w14="http://schemas.microsoft.com/office/word/2010/wordml" xmlns:w15="http://schemas.microsoft.com/office/word/2012/wordml" xmlns:w16cex="http://schemas.microsoft.com/office/word/2018/wordml/cex" xmlns:w16cid="http://schemas.microsoft.com/office/word/2016/wordml/cid" xmlns:w16="http://schemas.microsoft.com/office/word/2018/wordml" xmlns:w16du="http://schemas.microsoft.com/office/word/2023/wordml/word16du" xmlns:w16sdtdh="http://schemas.microsoft.com/office/word/2020/wordml/sdtdatahash" xmlns:w16sdtfl="http://schemas.microsoft.com/office/word/2024/wordml/sdtformatlock" xmlns:w16se="http://schemas.microsoft.com/office/word/2015/wordml/symex" xmlns:wpg="http://schemas.microsoft.com/office/word/2010/wordprocessingGroup" xmlns:wpi="http://schemas.microsoft.com/office/word/2010/wordprocessingInk" xmlns:wne="http://schemas.microsoft.com/office/word/2006/wordml" xmlns:wps="http://schemas.microsoft.com/office/word/2010/wordprocessingShape" mc:Ignorable="w14 w15 w16se w16cid w16 w16cex w16sdtdh w16sdtfl w16du wp14">
+  <w:abstractNum w:abstractNumId="0" w15:restartNumberingAfterBreak="0">
+    <w:nsid w:val="1BF70092"/>
+    <w:multiLevelType w:val="hybridMultilevel"/>
+    <w:tmpl w:val="143A4BDC"/>
+    <w:lvl w:ilvl="0" w:tplc="0415000F">
+      <w:start w:val="1"/>
+      <w:numFmt w:val="decimal"/>
+      <w:lvlText w:val="%1."/>
+      <w:lvlJc w:val="left"/>
+      <w:pPr>
+        <w:ind w:left="720" w:hanging="360"/>
+      </w:pPr>
+      <w:rPr>
+        <w:rFonts w:hint="default"/>
+      </w:rPr>
+    </w:lvl>
+    <w:lvl w:ilvl="1" w:tplc="04150019" w:tentative="1">
+      <w:start w:val="1"/>
+      <w:numFmt w:val="lowerLetter"/>
+      <w:lvlText w:val="%2."/>
+      <w:lvlJc w:val="left"/>
+      <w:pPr>
+        <w:ind w:left="1440" w:hanging="360"/>
+      </w:pPr>
+    </w:lvl>
+    <w:lvl w:ilvl="2" w:tplc="0415001B" w:tentative="1">
+      <w:start w:val="1"/>
+      <w:numFmt w:val="lowerRoman"/>
+      <w:lvlText w:val="%3."/>
+      <w:lvlJc w:val="right"/>
+      <w:pPr>
+        <w:ind w:left="2160" w:hanging="180"/>
+      </w:pPr>
+    </w:lvl>
+    <w:lvl w:ilvl="3" w:tplc="0415000F" w:tentative="1">
+      <w:start w:val="1"/>
+      <w:numFmt w:val="decimal"/>
+      <w:lvlText w:val="%4."/>
+      <w:lvlJc w:val="left"/>
+      <w:pPr>
+        <w:ind w:left="2880" w:hanging="360"/>
+      </w:pPr>
+    </w:lvl>
+    <w:lvl w:ilvl="4" w:tplc="04150019" w:tentative="1">
+      <w:start w:val="1"/>
+      <w:numFmt w:val="lowerLetter"/>
+      <w:lvlText w:val="%5."/>
+      <w:lvlJc w:val="left"/>
+      <w:pPr>
+        <w:ind w:left="3600" w:hanging="360"/>
+      </w:pPr>
+    </w:lvl>
+    <w:lvl w:ilvl="5" w:tplc="0415001B" w:tentative="1">
+      <w:start w:val="1"/>
+      <w:numFmt w:val="lowerRoman"/>
+      <w:lvlText w:val="%6."/>
+      <w:lvlJc w:val="right"/>
+      <w:pPr>
+        <w:ind w:left="4320" w:hanging="180"/>
+      </w:pPr>
+    </w:lvl>
+    <w:lvl w:ilvl="6" w:tplc="0415000F" w:tentative="1">
+      <w:start w:val="1"/>
+      <w:numFmt w:val="decimal"/>
+      <w:lvlText w:val="%7."/>
+      <w:lvlJc w:val="left"/>
+      <w:pPr>
+        <w:ind w:left="5040" w:hanging="360"/>
+      </w:pPr>
+    </w:lvl>
+    <w:lvl w:ilvl="7" w:tplc="04150019" w:tentative="1">
+      <w:start w:val="1"/>
+      <w:numFmt w:val="lowerLetter"/>
+      <w:lvlText w:val="%8."/>
+      <w:lvlJc w:val="left"/>
+      <w:pPr>
+        <w:ind w:left="5760" w:hanging="360"/>
+      </w:pPr>
+    </w:lvl>
+    <w:lvl w:ilvl="8" w:tplc="0415001B" w:tentative="1">
+      <w:start w:val="1"/>
+      <w:numFmt w:val="lowerRoman"/>
+      <w:lvlText w:val="%9."/>
+      <w:lvlJc w:val="right"/>
+      <w:pPr>
+        <w:ind w:left="6480" w:hanging="180"/>
+      </w:pPr>
+    </w:lvl>
+  </w:abstractNum>
+  <w:abstractNum w:abstractNumId="1" w15:restartNumberingAfterBreak="0">
+    <w:nsid w:val="219E5FDD"/>
+    <w:multiLevelType w:val="hybridMultilevel"/>
+    <w:tmpl w:val="07489884"/>
+    <w:lvl w:ilvl="0" w:tplc="0415000F">
+      <w:start w:val="1"/>
+      <w:numFmt w:val="decimal"/>
+      <w:lvlText w:val="%1."/>
+      <w:lvlJc w:val="left"/>
+      <w:pPr>
+        <w:ind w:left="720" w:hanging="360"/>
+      </w:pPr>
+      <w:rPr>
+        <w:rFonts w:hint="default"/>
+      </w:rPr>
+    </w:lvl>
+    <w:lvl w:ilvl="1" w:tplc="04150019" w:tentative="1">
+      <w:start w:val="1"/>
+      <w:numFmt w:val="lowerLetter"/>
+      <w:lvlText w:val="%2."/>
+      <w:lvlJc w:val="left"/>
+      <w:pPr>
+        <w:ind w:left="1440" w:hanging="360"/>
+      </w:pPr>
+    </w:lvl>
+    <w:lvl w:ilvl="2" w:tplc="0415001B" w:tentative="1">
+      <w:start w:val="1"/>
+      <w:numFmt w:val="lowerRoman"/>
+      <w:lvlText w:val="%3."/>
+      <w:lvlJc w:val="right"/>
+      <w:pPr>
+        <w:ind w:left="2160" w:hanging="180"/>
+      </w:pPr>
+    </w:lvl>
+    <w:lvl w:ilvl="3" w:tplc="0415000F" w:tentative="1">
+      <w:start w:val="1"/>
+      <w:numFmt w:val="decimal"/>
+      <w:lvlText w:val="%4."/>
+      <w:lvlJc w:val="left"/>
+      <w:pPr>
+        <w:ind w:left="2880" w:hanging="360"/>
+      </w:pPr>
+    </w:lvl>
+    <w:lvl w:ilvl="4" w:tplc="04150019" w:tentative="1">
+      <w:start w:val="1"/>
+      <w:numFmt w:val="lowerLetter"/>
+      <w:lvlText w:val="%5."/>
+      <w:lvlJc w:val="left"/>
+      <w:pPr>
+        <w:ind w:left="3600" w:hanging="360"/>
+      </w:pPr>
+    </w:lvl>
+    <w:lvl w:ilvl="5" w:tplc="0415001B" w:tentative="1">
+      <w:start w:val="1"/>
+      <w:numFmt w:val="lowerRoman"/>
+      <w:lvlText w:val="%6."/>
+      <w:lvlJc w:val="right"/>
+      <w:pPr>
+        <w:ind w:left="4320" w:hanging="180"/>
+      </w:pPr>
+    </w:lvl>
+    <w:lvl w:ilvl="6" w:tplc="0415000F" w:tentative="1">
+      <w:start w:val="1"/>
+      <w:numFmt w:val="decimal"/>
+      <w:lvlText w:val="%7."/>
+      <w:lvlJc w:val="left"/>
+      <w:pPr>
+        <w:ind w:left="5040" w:hanging="360"/>
+      </w:pPr>
+    </w:lvl>
+    <w:lvl w:ilvl="7" w:tplc="04150019" w:tentative="1">
+      <w:start w:val="1"/>
+      <w:numFmt w:val="lowerLetter"/>
+      <w:lvlText w:val="%8."/>
+      <w:lvlJc w:val="left"/>
+      <w:pPr>
+        <w:ind w:left="5760" w:hanging="360"/>
+      </w:pPr>
+    </w:lvl>
+    <w:lvl w:ilvl="8" w:tplc="0415001B" w:tentative="1">
+      <w:start w:val="1"/>
+      <w:numFmt w:val="lowerRoman"/>
+      <w:lvlText w:val="%9."/>
+      <w:lvlJc w:val="right"/>
+      <w:pPr>
+        <w:ind w:left="6480" w:hanging="180"/>
+      </w:pPr>
+    </w:lvl>
+  </w:abstractNum>
+  <w:abstractNum w:abstractNumId="2" w15:restartNumberingAfterBreak="0">
+    <w:nsid w:val="26B76EA1"/>
+    <w:multiLevelType w:val="hybridMultilevel"/>
+    <w:tmpl w:val="E93EA6FA"/>
+    <w:lvl w:ilvl="0" w:tplc="0415000F">
+      <w:start w:val="1"/>
+      <w:numFmt w:val="decimal"/>
+      <w:lvlText w:val="%1."/>
+      <w:lvlJc w:val="left"/>
+      <w:pPr>
+        <w:ind w:left="720" w:hanging="360"/>
+      </w:pPr>
+      <w:rPr>
+        <w:rFonts w:hint="default"/>
+      </w:rPr>
+    </w:lvl>
+    <w:lvl w:ilvl="1" w:tplc="04150019" w:tentative="1">
+      <w:start w:val="1"/>
+      <w:numFmt w:val="lowerLetter"/>
+      <w:lvlText w:val="%2."/>
+      <w:lvlJc w:val="left"/>
+      <w:pPr>
+        <w:ind w:left="1440" w:hanging="360"/>
+      </w:pPr>
+    </w:lvl>
+    <w:lvl w:ilvl="2" w:tplc="0415001B" w:tentative="1">
+      <w:start w:val="1"/>
+      <w:numFmt w:val="lowerRoman"/>
+      <w:lvlText w:val="%3."/>
+      <w:lvlJc w:val="right"/>
+      <w:pPr>
+        <w:ind w:left="2160" w:hanging="180"/>
+      </w:pPr>
+    </w:lvl>
+    <w:lvl w:ilvl="3" w:tplc="0415000F" w:tentative="1">
+      <w:start w:val="1"/>
+      <w:numFmt w:val="decimal"/>
+      <w:lvlText w:val="%4."/>
+      <w:lvlJc w:val="left"/>
+      <w:pPr>
+        <w:ind w:left="2880" w:hanging="360"/>
+      </w:pPr>
+    </w:lvl>
+    <w:lvl w:ilvl="4" w:tplc="04150019" w:tentative="1">
+      <w:start w:val="1"/>
+      <w:numFmt w:val="lowerLetter"/>
+      <w:lvlText w:val="%5."/>
+      <w:lvlJc w:val="left"/>
+      <w:pPr>
+        <w:ind w:left="3600" w:hanging="360"/>
+      </w:pPr>
+    </w:lvl>
+    <w:lvl w:ilvl="5" w:tplc="0415001B" w:tentative="1">
+      <w:start w:val="1"/>
+      <w:numFmt w:val="lowerRoman"/>
+      <w:lvlText w:val="%6."/>
+      <w:lvlJc w:val="right"/>
+      <w:pPr>
+        <w:ind w:left="4320" w:hanging="180"/>
+      </w:pPr>
+    </w:lvl>
+    <w:lvl w:ilvl="6" w:tplc="0415000F" w:tentative="1">
+      <w:start w:val="1"/>
+      <w:numFmt w:val="decimal"/>
+      <w:lvlText w:val="%7."/>
+      <w:lvlJc w:val="left"/>
+      <w:pPr>
+        <w:ind w:left="5040" w:hanging="360"/>
+      </w:pPr>
+    </w:lvl>
+    <w:lvl w:ilvl="7" w:tplc="04150019" w:tentative="1">
+      <w:start w:val="1"/>
+      <w:numFmt w:val="lowerLetter"/>
+      <w:lvlText w:val="%8."/>
+      <w:lvlJc w:val="left"/>
+      <w:pPr>
+        <w:ind w:left="5760" w:hanging="360"/>
+      </w:pPr>
+    </w:lvl>
+    <w:lvl w:ilvl="8" w:tplc="0415001B" w:tentative="1">
+      <w:start w:val="1"/>
+      <w:numFmt w:val="lowerRoman"/>
+      <w:lvlText w:val="%9."/>
+      <w:lvlJc w:val="right"/>
+      <w:pPr>
+        <w:ind w:left="6480" w:hanging="180"/>
+      </w:pPr>
+    </w:lvl>
+  </w:abstractNum>
+  <w:abstractNum w:abstractNumId="3" w15:restartNumberingAfterBreak="0">
+    <w:nsid w:val="3FF96B2F"/>
+    <w:multiLevelType w:val="hybridMultilevel"/>
+    <w:tmpl w:val="A81CE980"/>
+    <w:lvl w:ilvl="0" w:tplc="0415000F">
+      <w:start w:val="1"/>
+      <w:numFmt w:val="decimal"/>
+      <w:lvlText w:val="%1."/>
+      <w:lvlJc w:val="left"/>
+      <w:pPr>
+        <w:ind w:left="720" w:hanging="360"/>
+      </w:pPr>
+      <w:rPr>
+        <w:rFonts w:hint="default"/>
+      </w:rPr>
+    </w:lvl>
+    <w:lvl w:ilvl="1" w:tplc="04150019" w:tentative="1">
+      <w:start w:val="1"/>
+      <w:numFmt w:val="lowerLetter"/>
+      <w:lvlText w:val="%2."/>
+      <w:lvlJc w:val="left"/>
+      <w:pPr>
+        <w:ind w:left="1440" w:hanging="360"/>
+      </w:pPr>
+    </w:lvl>
+    <w:lvl w:ilvl="2" w:tplc="0415001B" w:tentative="1">
+      <w:start w:val="1"/>
+      <w:numFmt w:val="lowerRoman"/>
+      <w:lvlText w:val="%3."/>
+      <w:lvlJc w:val="right"/>
+      <w:pPr>
+        <w:ind w:left="2160" w:hanging="180"/>
+      </w:pPr>
+    </w:lvl>
+    <w:lvl w:ilvl="3" w:tplc="0415000F" w:tentative="1">
+      <w:start w:val="1"/>
+      <w:numFmt w:val="decimal"/>
+      <w:lvlText w:val="%4."/>
+      <w:lvlJc w:val="left"/>
+      <w:pPr>
+        <w:ind w:left="2880" w:hanging="360"/>
+      </w:pPr>
+    </w:lvl>
+    <w:lvl w:ilvl="4" w:tplc="04150019" w:tentative="1">
+      <w:start w:val="1"/>
+      <w:numFmt w:val="lowerLetter"/>
+      <w:lvlText w:val="%5."/>
+      <w:lvlJc w:val="left"/>
+      <w:pPr>
+        <w:ind w:left="3600" w:hanging="360"/>
+      </w:pPr>
+    </w:lvl>
+    <w:lvl w:ilvl="5" w:tplc="0415001B" w:tentative="1">
+      <w:start w:val="1"/>
+      <w:numFmt w:val="lowerRoman"/>
+      <w:lvlText w:val="%6."/>
+      <w:lvlJc w:val="right"/>
+      <w:pPr>
+        <w:ind w:left="4320" w:hanging="180"/>
+      </w:pPr>
+    </w:lvl>
+    <w:lvl w:ilvl="6" w:tplc="0415000F" w:tentative="1">
+      <w:start w:val="1"/>
+      <w:numFmt w:val="decimal"/>
+      <w:lvlText w:val="%7."/>
+      <w:lvlJc w:val="left"/>
+      <w:pPr>
+        <w:ind w:left="5040" w:hanging="360"/>
+      </w:pPr>
+    </w:lvl>
+    <w:lvl w:ilvl="7" w:tplc="04150019" w:tentative="1">
+      <w:start w:val="1"/>
+      <w:numFmt w:val="lowerLetter"/>
+      <w:lvlText w:val="%8."/>
+      <w:lvlJc w:val="left"/>
+      <w:pPr>
+        <w:ind w:left="5760" w:hanging="360"/>
+      </w:pPr>
+    </w:lvl>
+    <w:lvl w:ilvl="8" w:tplc="0415001B" w:tentative="1">
+      <w:start w:val="1"/>
+      <w:numFmt w:val="lowerRoman"/>
+      <w:lvlText w:val="%9."/>
+      <w:lvlJc w:val="right"/>
+      <w:pPr>
+        <w:ind w:left="6480" w:hanging="180"/>
+      </w:pPr>
+    </w:lvl>
+  </w:abstractNum>
+  <w:abstractNum w:abstractNumId="4" w15:restartNumberingAfterBreak="0">
+    <w:nsid w:val="4AB5437E"/>
+    <w:multiLevelType w:val="multilevel"/>
+    <w:tmpl w:val="0E342DDE"/>
+    <w:lvl w:ilvl="0">
+      <w:start w:val="1"/>
+      <w:numFmt w:val="bullet"/>
+      <w:lvlText w:val=""/>
+      <w:lvlJc w:val="left"/>
+      <w:pPr>
+        <w:tabs>
+          <w:tab w:val="num" w:pos="720"/>
+        </w:tabs>
+        <w:ind w:left="720" w:hanging="360"/>
+      </w:pPr>
+      <w:rPr>
+        <w:rFonts w:ascii="Symbol" w:hAnsi="Symbol" w:hint="default"/>
+        <w:sz w:val="20"/>
+      </w:rPr>
+    </w:lvl>
+    <w:lvl w:ilvl="1" w:tentative="1">
+      <w:start w:val="1"/>
+      <w:numFmt w:val="bullet"/>
+      <w:lvlText w:val="o"/>
+      <w:lvlJc w:val="left"/>
+      <w:pPr>
+        <w:tabs>
+          <w:tab w:val="num" w:pos="1440"/>
+        </w:tabs>
+        <w:ind w:left="1440" w:hanging="360"/>
+      </w:pPr>
+      <w:rPr>
+        <w:rFonts w:ascii="Courier New" w:hAnsi="Courier New" w:hint="default"/>
+        <w:sz w:val="20"/>
+      </w:rPr>
+    </w:lvl>
+    <w:lvl w:ilvl="2" w:tentative="1">
+      <w:start w:val="1"/>
+      <w:numFmt w:val="bullet"/>
+      <w:lvlText w:val=""/>
+      <w:lvlJc w:val="left"/>
+      <w:pPr>
+        <w:tabs>
+          <w:tab w:val="num" w:pos="2160"/>
+        </w:tabs>
+        <w:ind w:left="2160" w:hanging="360"/>
+      </w:pPr>
+      <w:rPr>
+        <w:rFonts w:ascii="Wingdings" w:hAnsi="Wingdings" w:hint="default"/>
+        <w:sz w:val="20"/>
+      </w:rPr>
+    </w:lvl>
+    <w:lvl w:ilvl="3" w:tentative="1">
+      <w:start w:val="1"/>
+      <w:numFmt w:val="bullet"/>
+      <w:lvlText w:val=""/>
+      <w:lvlJc w:val="left"/>
+      <w:pPr>
+        <w:tabs>
+          <w:tab w:val="num" w:pos="2880"/>
+        </w:tabs>
+        <w:ind w:left="2880" w:hanging="360"/>
+      </w:pPr>
+      <w:rPr>
+        <w:rFonts w:ascii="Wingdings" w:hAnsi="Wingdings" w:hint="default"/>
+        <w:sz w:val="20"/>
+      </w:rPr>
+    </w:lvl>
+    <w:lvl w:ilvl="4" w:tentative="1">
+      <w:start w:val="1"/>
+      <w:numFmt w:val="bullet"/>
+      <w:lvlText w:val=""/>
+      <w:lvlJc w:val="left"/>
+      <w:pPr>
+        <w:tabs>
+          <w:tab w:val="num" w:pos="3600"/>
+        </w:tabs>
+        <w:ind w:left="3600" w:hanging="360"/>
+      </w:pPr>
+      <w:rPr>
+        <w:rFonts w:ascii="Wingdings" w:hAnsi="Wingdings" w:hint="default"/>
+        <w:sz w:val="20"/>
+      </w:rPr>
+    </w:lvl>
+    <w:lvl w:ilvl="5" w:tentative="1">
+      <w:start w:val="1"/>
+      <w:numFmt w:val="bullet"/>
+      <w:lvlText w:val=""/>
+      <w:lvlJc w:val="left"/>
+      <w:pPr>
+        <w:tabs>
+          <w:tab w:val="num" w:pos="4320"/>
+        </w:tabs>
+        <w:ind w:left="4320" w:hanging="360"/>
+      </w:pPr>
+      <w:rPr>
+        <w:rFonts w:ascii="Wingdings" w:hAnsi="Wingdings" w:hint="default"/>
+        <w:sz w:val="20"/>
+      </w:rPr>
+    </w:lvl>
+    <w:lvl w:ilvl="6" w:tentative="1">
+      <w:start w:val="1"/>
+      <w:numFmt w:val="bullet"/>
+      <w:lvlText w:val=""/>
+      <w:lvlJc w:val="left"/>
+      <w:pPr>
+        <w:tabs>
+          <w:tab w:val="num" w:pos="5040"/>
+        </w:tabs>
+        <w:ind w:left="5040" w:hanging="360"/>
+      </w:pPr>
+      <w:rPr>
+        <w:rFonts w:ascii="Wingdings" w:hAnsi="Wingdings" w:hint="default"/>
+        <w:sz w:val="20"/>
+      </w:rPr>
+    </w:lvl>
+    <w:lvl w:ilvl="7" w:tentative="1">
+      <w:start w:val="1"/>
+      <w:numFmt w:val="bullet"/>
+      <w:lvlText w:val=""/>
+      <w:lvlJc w:val="left"/>
+      <w:pPr>
+        <w:tabs>
+          <w:tab w:val="num" w:pos="5760"/>
+        </w:tabs>
+        <w:ind w:left="5760" w:hanging="360"/>
+      </w:pPr>
+      <w:rPr>
+        <w:rFonts w:ascii="Wingdings" w:hAnsi="Wingdings" w:hint="default"/>
+        <w:sz w:val="20"/>
+      </w:rPr>
+    </w:lvl>
+    <w:lvl w:ilvl="8" w:tentative="1">
+      <w:start w:val="1"/>
+      <w:numFmt w:val="bullet"/>
+      <w:lvlText w:val=""/>
+      <w:lvlJc w:val="left"/>
+      <w:pPr>
+        <w:tabs>
+          <w:tab w:val="num" w:pos="6480"/>
+        </w:tabs>
+        <w:ind w:left="6480" w:hanging="360"/>
+      </w:pPr>
+      <w:rPr>
+        <w:rFonts w:ascii="Wingdings" w:hAnsi="Wingdings" w:hint="default"/>
+        <w:sz w:val="20"/>
+      </w:rPr>
+    </w:lvl>
+  </w:abstractNum>
+  <w:abstractNum w:abstractNumId="5" w15:restartNumberingAfterBreak="0">
+    <w:nsid w:val="52695DF1"/>
+    <w:multiLevelType w:val="hybridMultilevel"/>
+    <w:tmpl w:val="D350404A"/>
+    <w:lvl w:ilvl="0" w:tplc="0415000F">
+      <w:start w:val="1"/>
+      <w:numFmt w:val="decimal"/>
+      <w:lvlText w:val="%1."/>
+      <w:lvlJc w:val="left"/>
+      <w:pPr>
+        <w:ind w:left="720" w:hanging="360"/>
+      </w:pPr>
+      <w:rPr>
+        <w:rFonts w:hint="default"/>
+      </w:rPr>
+    </w:lvl>
+    <w:lvl w:ilvl="1" w:tplc="04150019" w:tentative="1">
+      <w:start w:val="1"/>
+      <w:numFmt w:val="lowerLetter"/>
+      <w:lvlText w:val="%2."/>
+      <w:lvlJc w:val="left"/>
+      <w:pPr>
+        <w:ind w:left="1440" w:hanging="360"/>
+      </w:pPr>
+    </w:lvl>
+    <w:lvl w:ilvl="2" w:tplc="0415001B" w:tentative="1">
+      <w:start w:val="1"/>
+      <w:numFmt w:val="lowerRoman"/>
+      <w:lvlText w:val="%3."/>
+      <w:lvlJc w:val="right"/>
+      <w:pPr>
+        <w:ind w:left="2160" w:hanging="180"/>
+      </w:pPr>
+    </w:lvl>
+    <w:lvl w:ilvl="3" w:tplc="0415000F" w:tentative="1">
+      <w:start w:val="1"/>
+      <w:numFmt w:val="decimal"/>
+      <w:lvlText w:val="%4."/>
+      <w:lvlJc w:val="left"/>
+      <w:pPr>
+        <w:ind w:left="2880" w:hanging="360"/>
+      </w:pPr>
+    </w:lvl>
+    <w:lvl w:ilvl="4" w:tplc="04150019" w:tentative="1">
+      <w:start w:val="1"/>
+      <w:numFmt w:val="lowerLetter"/>
+      <w:lvlText w:val="%5."/>
+      <w:lvlJc w:val="left"/>
+      <w:pPr>
+        <w:ind w:left="3600" w:hanging="360"/>
+      </w:pPr>
+    </w:lvl>
+    <w:lvl w:ilvl="5" w:tplc="0415001B" w:tentative="1">
+      <w:start w:val="1"/>
+      <w:numFmt w:val="lowerRoman"/>
+      <w:lvlText w:val="%6."/>
+      <w:lvlJc w:val="right"/>
+      <w:pPr>
+        <w:ind w:left="4320" w:hanging="180"/>
+      </w:pPr>
+    </w:lvl>
+    <w:lvl w:ilvl="6" w:tplc="0415000F" w:tentative="1">
+      <w:start w:val="1"/>
+      <w:numFmt w:val="decimal"/>
+      <w:lvlText w:val="%7."/>
+      <w:lvlJc w:val="left"/>
+      <w:pPr>
+        <w:ind w:left="5040" w:hanging="360"/>
+      </w:pPr>
+    </w:lvl>
+    <w:lvl w:ilvl="7" w:tplc="04150019" w:tentative="1">
+      <w:start w:val="1"/>
+      <w:numFmt w:val="lowerLetter"/>
+      <w:lvlText w:val="%8."/>
+      <w:lvlJc w:val="left"/>
+      <w:pPr>
+        <w:ind w:left="5760" w:hanging="360"/>
+      </w:pPr>
+    </w:lvl>
+    <w:lvl w:ilvl="8" w:tplc="0415001B" w:tentative="1">
+      <w:start w:val="1"/>
+      <w:numFmt w:val="lowerRoman"/>
+      <w:lvlText w:val="%9."/>
+      <w:lvlJc w:val="right"/>
+      <w:pPr>
+        <w:ind w:left="6480" w:hanging="180"/>
+      </w:pPr>
+    </w:lvl>
+  </w:abstractNum>
+  <w:abstractNum w:abstractNumId="6" w15:restartNumberingAfterBreak="0">
+    <w:nsid w:val="6AD70754"/>
+    <w:multiLevelType w:val="hybridMultilevel"/>
+    <w:tmpl w:val="2B9E95B6"/>
+    <w:lvl w:ilvl="0" w:tplc="0415000F">
+      <w:start w:val="1"/>
+      <w:numFmt w:val="decimal"/>
+      <w:lvlText w:val="%1."/>
+      <w:lvlJc w:val="left"/>
+      <w:pPr>
+        <w:ind w:left="720" w:hanging="360"/>
+      </w:pPr>
+      <w:rPr>
+        <w:rFonts w:hint="default"/>
+      </w:rPr>
+    </w:lvl>
+    <w:lvl w:ilvl="1" w:tplc="04150019" w:tentative="1">
+      <w:start w:val="1"/>
+      <w:numFmt w:val="lowerLetter"/>
+      <w:lvlText w:val="%2."/>
+      <w:lvlJc w:val="left"/>
+      <w:pPr>
+        <w:ind w:left="1440" w:hanging="360"/>
+      </w:pPr>
+    </w:lvl>
+    <w:lvl w:ilvl="2" w:tplc="0415001B" w:tentative="1">
+      <w:start w:val="1"/>
+      <w:numFmt w:val="lowerRoman"/>
+      <w:lvlText w:val="%3."/>
+      <w:lvlJc w:val="right"/>
+      <w:pPr>
+        <w:ind w:left="2160" w:hanging="180"/>
+      </w:pPr>
+    </w:lvl>
+    <w:lvl w:ilvl="3" w:tplc="0415000F" w:tentative="1">
+      <w:start w:val="1"/>
+      <w:numFmt w:val="decimal"/>
+      <w:lvlText w:val="%4."/>
+      <w:lvlJc w:val="left"/>
+      <w:pPr>
+        <w:ind w:left="2880" w:hanging="360"/>
+      </w:pPr>
+    </w:lvl>
+    <w:lvl w:ilvl="4" w:tplc="04150019" w:tentative="1">
+      <w:start w:val="1"/>
+      <w:numFmt w:val="lowerLetter"/>
+      <w:lvlText w:val="%5."/>
+      <w:lvlJc w:val="left"/>
+      <w:pPr>
+        <w:ind w:left="3600" w:hanging="360"/>
+      </w:pPr>
+    </w:lvl>
+    <w:lvl w:ilvl="5" w:tplc="0415001B" w:tentative="1">
+      <w:start w:val="1"/>
+      <w:numFmt w:val="lowerRoman"/>
+      <w:lvlText w:val="%6."/>
+      <w:lvlJc w:val="right"/>
+      <w:pPr>
+        <w:ind w:left="4320" w:hanging="180"/>
+      </w:pPr>
+    </w:lvl>
+    <w:lvl w:ilvl="6" w:tplc="0415000F" w:tentative="1">
+      <w:start w:val="1"/>
+      <w:numFmt w:val="decimal"/>
+      <w:lvlText w:val="%7."/>
+      <w:lvlJc w:val="left"/>
+      <w:pPr>
+        <w:ind w:left="5040" w:hanging="360"/>
+      </w:pPr>
+    </w:lvl>
+    <w:lvl w:ilvl="7" w:tplc="04150019" w:tentative="1">
+      <w:start w:val="1"/>
+      <w:numFmt w:val="lowerLetter"/>
+      <w:lvlText w:val="%8."/>
+      <w:lvlJc w:val="left"/>
+      <w:pPr>
+        <w:ind w:left="5760" w:hanging="360"/>
+      </w:pPr>
+    </w:lvl>
+    <w:lvl w:ilvl="8" w:tplc="0415001B" w:tentative="1">
+      <w:start w:val="1"/>
+      <w:numFmt w:val="lowerRoman"/>
+      <w:lvlText w:val="%9."/>
+      <w:lvlJc w:val="right"/>
+      <w:pPr>
+        <w:ind w:left="6480" w:hanging="180"/>
+      </w:pPr>
+    </w:lvl>
+  </w:abstractNum>
+  <w:num w:numId="1" w16cid:durableId="231086834">
+    <w:abstractNumId w:val="5"/>
+  </w:num>
+  <w:num w:numId="2" w16cid:durableId="1638681361">
+    <w:abstractNumId w:val="6"/>
+  </w:num>
+  <w:num w:numId="3" w16cid:durableId="1518810594">
+    <w:abstractNumId w:val="3"/>
+  </w:num>
+  <w:num w:numId="4" w16cid:durableId="1328362372">
+    <w:abstractNumId w:val="0"/>
+  </w:num>
+  <w:num w:numId="5" w16cid:durableId="1883983115">
+    <w:abstractNumId w:val="2"/>
+  </w:num>
+  <w:num w:numId="6" w16cid:durableId="457988822">
+    <w:abstractNumId w:val="1"/>
+  </w:num>
+  <w:num w:numId="7" w16cid:durableId="164709293">
+    <w:abstractNumId w:val="4"/>
+  </w:num>
+</w:numbering>
 </file>
 
 <file path=word/styles.xml><?xml version="1.0" encoding="utf-8"?>
@@ -2964,7 +5425,6 @@
   <w:style w:type="character" w:default="1" w:styleId="Domylnaczcionkaakapitu">
     <w:name w:val="Default Paragraph Font"/>
     <w:uiPriority w:val="1"/>
-    <w:semiHidden/>
     <w:unhideWhenUsed/>
   </w:style>
   <w:style w:type="table" w:default="1" w:styleId="Standardowy">

</xml_diff>